<commit_message>
Paper 1 R8c: remove residual parity wording, 'no recall cost' -> exact figures (9.4->5.7%, recall@5 -0.2, CI -0.5..0.0), 335-rule claim limited to recall@5 (recall@10 -1.2), author approval marked pending; track eval/realdata/*.py benchmark scripts and three figure-data JSONs previously gitignored (Table S17 now fully resolvable)
</commit_message>
<xml_diff>
--- a/docs/paper1/v7/Paper1_Hemoglyph_CMPB_EN_v7_R8.docx
+++ b/docs/paper1/v7/Paper1_Hemoglyph_CMPB_EN_v7_R8.docx
@@ -95,7 +95,7 @@
     </w:p>
     <w:p>
       <w:r>
-        <w:t>- Four reproducible methods verify an AI-drafted clinical rule base before clinical audit</w:t>
+        <w:t>- Four reproducible methods verify an AI-drafted rule base before clinician review</w:t>
       </w:r>
     </w:p>
     <w:p>
@@ -110,7 +110,7 @@
     </w:p>
     <w:p>
       <w:r>
-        <w:t>- 335 curated or quote-verified rules alone reproduce the primary results (Δ@5 = 0.0)</w:t>
+        <w:t>- 335 curated/quote-verified rules alone keep recall@5 (Δ 0.0); recall@10 −1.2 points</w:t>
       </w:r>
     </w:p>
     <w:p>
@@ -137,7 +137,7 @@
         <w:t>Background and Objective:</w:t>
       </w:r>
       <w:r>
-        <w:t xml:space="preserve"> LLM-drafted clinical rule bases are validated on vignettes, rarely against their sources; clinically auditing tens of thousands of rules is impractical. We ask what four methods—executable invariants, a frozen source-concordance protocol, a hash-frozen benchmark and an audit of the audit—establish beforehand, for Hemoglyph, an offline engine ranking a cited laboratory-panel differential with 33,183 executable rules (99.2% AI-drafted).</w:t>
+        <w:t xml:space="preserve"> LLM-drafted clinical rule bases are validated on vignettes, rarely against their sources; clinician audit of tens of thousands is impractical. We ask what four methods—executable invariants, a frozen source-concordance protocol, a hash-frozen benchmark and an audit of the audit—establish beforehand, for Hemoglyph, an offline engine ranking a cited laboratory-panel differential with 33,183 executable rules (99.2% AI-drafted).</w:t>
       </w:r>
     </w:p>
     <w:p>
@@ -148,7 +148,7 @@
         <w:t>Methods:</w:t>
       </w:r>
       <w:r>
-        <w:t xml:space="preserve"> Property-based tests check invariants (determinism, unit invariance, monotonicity, absent analyte) on random panels, on real panels shared with an LLM, and as a verifier behind it. A frozen protocol audits 200 sampled rules against their locators, then 100 rules an activity log over 3,814 real panels shows drive output. Hash-frozen benchmarks covered the eICU-CRD demo (2,314 ICU stays), 9,000 NHANES adults, 14,420 sepsis patients and external cohorts, with ablation and a blinded 400-stay LLM comparison. A pre-specified audit study tested core sufficiency, detector mutation recall and transfer to a second corpus.</w:t>
+        <w:t xml:space="preserve"> Property-based tests check invariants (determinism, unit invariance, monotonicity, absent analyte) on random panels, on real panels shared with an LLM, and as a verifier behind it. A frozen protocol audited 200 sampled rules against their locators, then 100 rules an activity log over 3,814 real panels shows drive output. Hash-frozen benchmarks covered the eICU-CRD demo (2,314 ICU stays), 9,000 NHANES adults, 14,420 sepsis patients and external cohorts, plus ablation and a blinded 400-stay LLM comparison. An audit study tested core sufficiency, detector mutation recall and transfer to a second corpus.</w:t>
       </w:r>
     </w:p>
     <w:p>
@@ -159,7 +159,7 @@
         <w:t>Results:</w:t>
       </w:r>
       <w:r>
-        <w:t xml:space="preserve"> The invariants exposed a ranking defect that 353 vignettes missed. Of 200 audited rules, 92% (95% CI 87.4–95.1) were unresolvable, ≥7.5% discordant. Only 364 rules (1.1%) ever drove a top-10 differential; of 100 sampled, 6 were concordant and 92 unresolvable. 60.8% (58.7–62.9) of clinician-listed ICU diagnoses ranked top-five (prevalence baseline 51.3%); sepsis prediction failed as pre-specified. Engine and LLM recall@5 did not differ detectably (60.7% vs 59.6%; +1.2 points, 95% CI −2.5 to +5.1; no equivalence margin pre-specified). SI units left the engine's top-5 unchanged in 40/40 panels versus 8/40; as a verifier it removed 40% of the LLM's unsupported assertions at no recall cost. The 335 curated or quote-verified rules alone changed recall@3/@5 by ≤0.2 points (@10 −1.2); static detectors caught 74–100% of structural mutants but ≤13% of plausible wrong thresholds, and a second LLM-written corpus showed the same defects.</w:t>
+        <w:t xml:space="preserve"> The invariants exposed a ranking defect that 353 vignettes missed. Of 200 audited rules, 92% (95% CI 87.4–95.1) were unresolvable, ≥7.5% discordant. Only 364 rules (1.1%) ever drove a top-10 differential; of 100 sampled, 6 were concordant, 92 unresolvable. 60.8% (58.7–62.9) of clinician-listed ICU diagnoses ranked top-five (baseline 51.3%); sepsis prediction failed as pre-specified. Engine and LLM recall@5 did not differ detectably (60.7% vs 59.6%; +1.2 points, 95% CI −2.5 to +5.1; no equivalence margin pre-specified). SI units left engine top-5 unchanged in 40/40 panels versus 8/40; as a verifier it cut the LLM's unsupported top-5 assertions from 9.4% to 5.7% (recall@5 59.6% → 59.4%; CI −0.5 to 0.0). The 335 curated or quote-verified rules alone kept recall@3/@5 within 0.2 points (@10 −1.2); static detectors caught 74–100% of structural mutants but ≤13% of plausible wrong thresholds, and a second LLM-written corpus showed the same defects.</w:t>
       </w:r>
     </w:p>
     <w:p>
@@ -170,7 +170,7 @@
         <w:t>Conclusions:</w:t>
       </w:r>
       <w:r>
-        <w:t xml:space="preserve"> The methods are cheap, reproducible and here unfavourably informative: provenance granularity limits auditability, 1% of rules carries the output, static checks miss plausible errors. A traceable engine was not detectably different from a frontier LLM and can verify it. No clinician audited the rules; no clinical claim is made. Code, rules, outputs and the pre-specified human-audit protocol are public.</w:t>
+        <w:t xml:space="preserve"> The methods are cheap, reproducible and, here, unfavourable: provenance granularity limits auditability, 1% of rules carries the output, static checks miss plausible errors. A traceable engine did not differ detectably from a frontier LLM and can verify it. No clinician audited the rules; no clinical claim is made. Code, rules, outputs and a pre-specified human-audit protocol are public.</w:t>
       </w:r>
     </w:p>
     <w:p>
@@ -719,7 +719,7 @@
     </w:p>
     <w:p>
       <w:r>
-        <w:t>Each method produced information that conventional validation had not: two engine defects that 353 adversarial vignettes missed; a rule base that cannot be audited from its own locators, with at least 7.5% of sampled rules discordant; an output carried by 1.1% of rules that fail in the same way as the bulk; recall@5 not detectably different from a frontier LLM (no equivalence margin was pre-specified) while a prevalence baseline reached 51%, so the engine's contribution is ordering (NDCG@5 56.5% vs 39.0%) and specificity, not coverage; and an audit of the audit showing that 335 curated or quote-verified rules reproduce the primary results, that static detectors catch structural but not plausible defects, and that a second LLM-written rule set shows the same defect classes.</w:t>
+        <w:t>Each method produced information that conventional validation had not: two engine defects that 353 adversarial vignettes missed; a rule base that cannot be audited from its own locators, with at least 7.5% of sampled rules discordant; an output carried by 1.1% of rules that fail in the same way as the bulk; recall@5 not detectably different from a frontier LLM (no equivalence margin was pre-specified) while a prevalence baseline reached 51%, so the engine's contribution is ordering (NDCG@5 56.5% vs 39.0%) and specificity, not coverage; and an audit of the audit showing that 335 curated or quote-verified rules preserve recall@3/@5 (|Δ| ≤ 0.2 points) while reducing recall@10 by 1.2 points, that static detectors catch structural but not plausible defects, and that a second LLM-written rule set shows the same defect classes.</w:t>
       </w:r>
     </w:p>
     <w:p>
@@ -733,7 +733,7 @@
         <w:t>behind</w:t>
       </w:r>
       <w:r>
-        <w:t xml:space="preserve"> the LLM, removing 40% of its unsupported top-5 assertions at no recall cost; fusing the two did not help at rank 5, because filtering admits only the verifiable while the engine's residual advantage lies in outcome syndromes no single criterion verifies. Invariants establish consistency, not correctness: a mistranscribed threshold passes every invariant (mutation recall 0.003 for a plausible wrong number). The concordance audit shows why correctness is hard to reach: the limiting factor was locator granularity, not rater effort—organisation-level URLs and generic standards make 92% of rules uncheckable, and where checking was possible the error was usually attribution. Audit protocols should therefore require the verbatim source sentence for every verdict, registries should carry section- or table-level locators, and an independent clinical audit is the next step, and its protocol—50 active-core and 50 anchor rules, two blinded clinical raters, verbatim-quote verdicts, Cohen's κ, sample size and stopping rule—is fixed in Supplementary Note 19 before any rater is recruited. All four tools transfer unchanged to any rule base whose records carry analyte, operator, threshold, unit, population and locator.</w:t>
+        <w:t xml:space="preserve"> the LLM, reducing its unsupported top-5 assertions from 9.4% to 5.7% while recall@5 changed by −0.2 points (95% CI −0.5 to 0.0); fusing the two did not help at rank 5, because filtering admits only the verifiable while the engine's residual advantage lies in outcome syndromes no single criterion verifies. Invariants establish consistency, not correctness: a mistranscribed threshold passes every invariant (mutation recall 0.003 for a plausible wrong number). The concordance audit shows why correctness is hard to reach: the limiting factor was locator granularity, not rater effort—organisation-level URLs and generic standards make 92% of rules uncheckable, and where checking was possible the error was usually attribution. Audit protocols should therefore require the verbatim source sentence for every verdict, registries should carry section- or table-level locators, and an independent clinical audit is the next step, and its protocol—50 active-core and 50 anchor rules, two blinded clinical raters, verbatim-quote verdicts, Cohen's κ, sample size and stopping rule—is fixed in Supplementary Note 19 before any rater is recruited. All four tools transfer unchanged to any rule base whose records carry analyte, operator, threshold, unit, population and locator.</w:t>
       </w:r>
     </w:p>
     <w:p>
@@ -770,7 +770,7 @@
     </w:p>
     <w:p>
       <w:r>
-        <w:t>Executable invariants, a frozen source-concordance protocol with an activity log, a hash-frozen one-shot benchmark and an audit of the audit are four low-cost, reproducible methods for verifying an AI-drafted clinical rule base; a rule engine whose every output carries a rule identifier, threshold and source can be audited in ways a language model cannot, and can audit the language model's output in turn. Applied to Hemoglyph they found defects that vignettes had missed, showed that provenance granularity rather than rule count limits auditability, that 1.1% of the rules carry the output and 335 curated or quote-verified rules reproduce the primary results alone, that static checks cannot catch a plausible wrong number, and showed an untrained, traceable engine not detectably different from a frontier LLM close to the ceiling the reference standard allows. The limits—an unaudited rule base, outcome-defined syndromes, uncalibrated scores—are stated so that they can be measured and closed.</w:t>
+        <w:t>Executable invariants, a frozen source-concordance protocol with an activity log, a hash-frozen one-shot benchmark and an audit of the audit are four low-cost, reproducible methods for verifying an AI-drafted clinical rule base; a rule engine whose every output carries a rule identifier, threshold and source can be audited in ways a language model cannot, and can audit the language model's output in turn. Applied to Hemoglyph they found defects that vignettes had missed, showed that provenance granularity rather than rule count limits auditability, that 1.1% of the rules carry the output and that 335 curated or quote-verified rules alone preserve recall@5 while reducing recall@10 by 1.2 points, that static checks cannot catch a plausible wrong number, and showed an untrained, traceable engine not detectably different from a frontier LLM close to the ceiling the reference standard allows. The limits—an unaudited rule base, outcome-defined syndromes, uncalibrated scores—are stated so that they can be measured and closed.</w:t>
       </w:r>
     </w:p>
     <w:p>
@@ -863,7 +863,7 @@
         <w:t>Ehsan Bahrami Samani:</w:t>
       </w:r>
       <w:r>
-        <w:t xml:space="preserve"> Methodology (statistical supervision), Supervision, Writing – review &amp; editing. All authors approved the final version. </w:t>
+        <w:t xml:space="preserve"> Methodology (statistical supervision), Supervision, Writing – review &amp; editing. Approval of the final version by all authors is pending and will be confirmed before submission. </w:t>
       </w:r>
       <w:r>
         <w:rPr>
@@ -9980,7 +9980,7 @@
     </w:p>
     <w:p>
       <w:r>
-        <w:t>Our design addresses criticisms levelled at recent LLM benchmarks—unstable metrics, leakage and post-hoc selection [26,31]. Releases were frozen with manifests; quarantine data were run once; a failed round is reported with its original criteria and the subsequent weakening to non-inferiority is disclosed; the post-hoc sepsis additions are labelled. The cost of correctness is visible: moving from the product release to v7 cost three points of flat recall, almost entirely because a single creatinine no longer asserts CKD and a normal leukocyte count no longer yields a syndrome; our first submission reported superiority over the LLM against an earlier engine version, and re-scoring against the frozen release reduced that to parity. Compared with Isabel and DXplain, which take symptoms and have been evaluated on 36–201 cases [13–16,32], this study isolates laboratory-only reasoning on more than 20,000 real encounters and releases its knowledge base under an open licence at a time when the main public executable-guideline repository has been withdrawn. Because the rules were AI-drafted, open release is a precondition for—not a substitute for—expert audit; every leaf carries a source locator, so a clinician can accept, amend or reject a rule and the change is versioned.</w:t>
+        <w:t>Our design addresses criticisms levelled at recent LLM benchmarks—unstable metrics, leakage and post-hoc selection [26,31]. Releases were frozen with manifests; quarantine data were run once; a failed round is reported with its original criteria and the subsequent weakening to non-inferiority is disclosed; the post-hoc sepsis additions are labelled. The cost of correctness is visible: moving from the product release to v7 cost three points of flat recall, almost entirely because a single creatinine no longer asserts CKD and a normal leukocyte count no longer yields a syndrome; our first submission reported superiority over the LLM against an earlier engine version, and the apparent advantage was not retained when the frozen v7 engine was evaluated. Compared with Isabel and DXplain, which take symptoms and have been evaluated on 36–201 cases [13–16,32], this study isolates laboratory-only reasoning on more than 20,000 real encounters and releases its knowledge base under an open licence at a time when the main public executable-guideline repository has been withdrawn. Because the rules were AI-drafted, open release is a precondition for—not a substitute for—expert audit; every leaf carries a source locator, so a clinician can accept, amend or reject a rule and the change is versioned.</w:t>
       </w:r>
     </w:p>
     <w:p>

</xml_diff>

<commit_message>
R8e: clean-clone reproduction PASS (quick/v7/eicu; Tables 3-4 identical) -> Note 21 + REPRODUCTION_LOG; Note 20 held-out mutation; Table S18 auditability; main text + Data availability + limitations updated; supplement rebuilt
</commit_message>
<xml_diff>
--- a/docs/paper1/v7/Paper1_Hemoglyph_CMPB_EN_v7_R8.docx
+++ b/docs/paper1/v7/Paper1_Hemoglyph_CMPB_EN_v7_R8.docx
@@ -675,7 +675,7 @@
         <w:jc w:val="left"/>
       </w:pPr>
       <w:r>
-        <w:t xml:space="preserve">Of 200 rules sampled under the frozen protocol (Fig. 3b), only 16 could be resolved from the locators the registry provides: 15 were discordant—7 attribution errors among curated anchors (e.g. a hypernatraemia rule citing the hyponatraemia guideline) and 8 thresholds or definitions absent from an on-topic source (e.g. a candidate acute-kidney-injury "criterion" defined by a fixed creatinine &gt; 1.1 mg/dL and attributed to KDIGO 2012, which defines AKI only by change from baseline)—and 1 concordant. The remaining 184 (92%, 95% CI 87.4–95.1) were unresolvable: 12 with no retrievable text, 55 with only a title or abstract, 46 citing generic methodological standards that cannot contain a disease-specific threshold, and 71 organisation landing pages. Because an attribution error is visible from a title while concordance needs the full text, 15/16 is not an estimate of the discordance rate; the defensible statements are that at least 7.5% (4.6–12.0) of sampled rules are demonstrably discordant and that the registry is not auditable rule-by-rule from its own locators. A provenance scan of all 785 sources resolved 112 DOIs via Crossref and reached 533 landing pages; 39 were unreachable, 34 lacked a locator, nine invalid DOIs were removed and 28 rules were flagged </w:t>
+        <w:t xml:space="preserve">Of 200 rules sampled under the frozen protocol (Fig. 3b), only 16 could be resolved from the locators the registry provides: 15 were discordant—7 attribution errors among curated anchors (e.g. a hypernatraemia rule citing the hyponatraemia guideline) and 8 thresholds or definitions absent from an on-topic source (e.g. a candidate acute-kidney-injury "criterion" defined by a fixed creatinine &gt; 1.1 mg/dL and attributed to KDIGO 2012, which defines AKI only by change from baseline)—and 1 concordant. The remaining 184 (92%, 95% CI 87.4–95.1) were unresolvable: 12 with no retrievable text, 55 with only a title or abstract, 46 citing generic methodological standards that cannot contain a disease-specific threshold, and 71 organisation landing pages. Separating retrievability from verifiability (Supplementary Table S18), 94.0% (89.8–96.5) of the sampled rules had at least one source that opened to ≥500 characters of text, but only 8.0% (5.0–12.6) had the encoded statement located in it; DOI/PMC locators were retrievable in 100% of cases yet located the statement in 10%, organisation landing pages in 0%. Because an attribution error is visible from a title while concordance needs the full text, 15/16 is not an estimate of the discordance rate; the defensible statements are that at least 7.5% (4.6–12.0) of sampled rules are demonstrably discordant and that the registry is not auditable rule-by-rule from its own locators. A provenance scan of all 785 sources resolved 112 DOIs via Crossref and reached 533 landing pages; 39 were unreachable, 34 lacked a locator, nine invalid DOIs were removed and 28 rules were flagged </w:t>
       </w:r>
       <w:r>
         <w:rPr>
@@ -863,7 +863,7 @@
         <w:t>Mutation.</w:t>
       </w:r>
       <w:r>
-        <w:t xml:space="preserve"> (Fig. 3c) Detector recall was 1.00 for inverted or impossible tiers (301/301), 0.98 for multi-analyte rules collapsed to a single ubiquitous analyte (138/141), 0.74 for unit substitution (113/152), 0.55 for thresholds pushed outside physiological limits (40/73), 0.46 for random source substitution (40/88), 0.13 for operator flips (36/274) and 0.003 for plausible threshold changes (1/303); specificity on unmutated seeds was 0.974, and four of the eight flagged seeds were real defects (an adult haemoglobin threshold under a neonatal population gate). These, with 126 unit-label and 14 source errors found during calibration, were corrected in registry 15.2.0 under a written protocol, with every eICU and NHANES gate count identical before and after. </w:t>
+        <w:t xml:space="preserve"> (Fig. 3c) Detector recall was 1.00 for inverted or impossible tiers (301/301), 0.98 for multi-analyte rules collapsed to a single ubiquitous analyte (138/141), 0.74 for unit substitution (113/152), 0.55 for thresholds pushed outside physiological limits (40/73), 0.46 for random source substitution (40/88), 0.13 for operator flips (36/274) and 0.003 for plausible threshold changes (1/303); specificity on unmutated seeds was 0.974, and four of the eight flagged seeds were real defects (an adult haemoglobin threshold under a neonatal population gate). These, with 126 unit-label and 14 source errors found during calibration, were corrected in registry 15.2.0 under a written protocol, with every eICU and NHANES gate count identical before and after. Because these recalls were measured on the registry the detectors were tuned on, a held-out test with eight new mutation families was pre-registered and run afterwards on 300 AI-drafted rules of registry 15.3.0 and on the 400-rule external corpus (Supplementary Note 20): unit-swap recall held (0.81 and 0.70), operator-flip recall fell to 0.035 on the sparse external corpus, decimal-place errors were caught in 13–16%, a benign unit conversion was never flagged, and—as pre-stated—removing a population gate, swapping in a same-domain source, encoding a contradictory conjunction or shifting a threshold by 20% were missed in ≥98% of cases. </w:t>
       </w:r>
       <w:r>
         <w:rPr>
@@ -966,7 +966,7 @@
         <w:jc w:val="left"/>
       </w:pPr>
       <w:r>
-        <w:t>No clinician audited the rules or adjudicated outputs; both concordance audits are single-rater, by a declared AI agent, without inter-rater reliability, so the concordance estimates are provisional until the protocol in Supplementary Note 19 is executed. The LLM comparison tested superiority, not equivalence; p = 0.54 does not establish parity. Nearly three quarters of the executable rules are generated two-analyte templates citing a generic standards page; "dormant" means dormant on the analyte coverage of the two corpora used. The components that carry the result were written by a non-clinician first author; 34 sources lack a locator; Bayesian priors are hand-coded without a per-value citation table; no version-control history exists for the development period. Only the open demo subsets of eICU and MIMIC-IV were used, with problem lists and ICD codes as reference standards. The LLM comparison is an author-run self-baseline through a platform that does not disclose the model, without retrieval augmentation or clinician adjudication, and the model's training data may include the public eICU demo. Quarantine criteria were weakened after round 1; the panel-supported metric is post hoc; NHANES laboratory-defined labels overlap the inputs; raw scores are uncalibrated; external cohorts are small; the OCR front end, Iranian populations and non-English laboratory conventions were not evaluated. The verifier's criteria are proxies and its synonym map is coarse, so its verdicts bound rather than measure unsupported assertion. The static detectors were calibrated on the registry they then scored, the second LLM-written corpus was produced by the same agent that wrote them, and they are blind to plausible wrong thresholds by construction. The first author is a secondary-school student with a financial interest in the commercial product, and the system, including 99.2% of the rules, was developed with AI-agent assistance. Hemoglyph is a research prototype with no regulatory clearance.</w:t>
+        <w:t>No clinician audited the rules or adjudicated outputs; both concordance audits are single-rater, by a declared AI agent, without inter-rater reliability, so the concordance estimates are provisional until the protocol in Supplementary Note 19 is executed. The LLM comparison tested superiority, not equivalence; p = 0.54 does not establish parity. Nearly three quarters of the executable rules are generated two-analyte templates citing a generic standards page; "dormant" means dormant on the analyte coverage of the two corpora used. The components that carry the result were written by a non-clinician first author; 34 sources lack a locator; Bayesian priors are hand-coded without a per-value citation table; no version-control history exists for the development period. Only the open demo subsets of eICU and MIMIC-IV were used, with problem lists and ICD codes as reference standards. The LLM comparison is an author-run self-baseline through a platform that does not disclose the model, without retrieval augmentation or clinician adjudication, and the model's training data may include the public eICU demo. Quarantine criteria were weakened after round 1; the panel-supported metric is post hoc; NHANES laboratory-defined labels overlap the inputs; raw scores are uncalibrated; external cohorts are small; the OCR front end, Iranian populations and non-English laboratory conventions were not evaluated. The verifier's criteria are proxies and its synonym map is coarse, so its verdicts bound rather than measure unsupported assertion. The static detectors were calibrated on the registry they then scored (the held-out test of Supplementary Note 20 bounds the resulting optimism for two families and confirms blindness to population-gate, same-domain-source, contradictory-conjunction and ±20% threshold defects), and the second LLM-written corpus was produced by the same agent that wrote them. The first author is a secondary-school student with a financial interest in the commercial product, and the system, including 99.2% of the rules, was developed with AI-agent assistance. Hemoglyph is a research prototype with no regulatory clearance.</w:t>
       </w:r>
     </w:p>
     <w:p>
@@ -1119,7 +1119,7 @@
         <w:t>Data and code availability.</w:t>
       </w:r>
       <w:r>
-        <w:t xml:space="preserve"> eICU-CRD demo (physionet.org/files/eicu-crd-demo/2.0.1/), MIMIC-IV demo, PhysioNet/CinC 2019 (physionet.org/files/challenge-2019/1.0.0/training/), NHANES (wwwn.cdc.gov/nchs/nhanes), UCI and ILPD repositories are public. Per-stay outputs, label maps, LLM prompts and outputs are provided as Supplementary Data. Engine and evaluation scripts (AGPL-3.0-or-later) and the rule registries (CC BY-SA 4.0) are public on GitHub (github.com/sobahramisamani-droid); the frozen v7/14.1.0 snapshot with freeze manifests, per-stay outputs and </w:t>
+        <w:t xml:space="preserve"> eICU-CRD demo (physionet.org/files/eicu-crd-demo/2.0.1/), MIMIC-IV demo, PhysioNet/CinC 2019 (physionet.org/files/challenge-2019/1.0.0/training/), NHANES (wwwn.cdc.gov/nchs/nhanes), UCI and ILPD repositories are public. Per-stay outputs, label maps, LLM prompts and outputs are provided as Supplementary Data. Engine and evaluation scripts (AGPL-3.0-or-later) and the rule registries (CC BY-SA 4.0) are public on GitHub (github.com/sobahramisamani-droid); </w:t>
       </w:r>
       <w:r>
         <w:rPr>
@@ -1127,10 +1127,21 @@
           <w:color w:val="000000"/>
           <w:sz w:val="22"/>
         </w:rPr>
-        <w:t>reproduce.sh</w:t>
-      </w:r>
-      <w:r>
-        <w:t xml:space="preserve"> will be archived on Zenodo with a DOI before publication. Hardware used for all timings: 2 vCPU Intel Xeon 2.60 GHz, 2 GB RAM, Linux 6.1, Python 3.13.</w:t>
+        <w:t>bash reproduce.sh</w:t>
+      </w:r>
+      <w:r>
+        <w:t xml:space="preserve"> rebuilds engine v7 from the git tag </w:t>
+      </w:r>
+      <w:r>
+        <w:rPr>
+          <w:rFonts w:ascii="Courier New" w:hAnsi="Courier New" w:eastAsia="Courier New" w:cs="Courier New"/>
+          <w:color w:val="000000"/>
+          <w:sz w:val="22"/>
+        </w:rPr>
+        <w:t>engine-v7-frozen</w:t>
+      </w:r>
+      <w:r>
+        <w:t>, checks it against the freeze manifests, re-runs the tests, the verification ledger, the mutation table and the frozen v7 engine on NHANES and eICU, and fails on any difference from Tables 3 and 4; the authors' clean-clone run reproduced every checked number (Supplementary Note 21), with one documented difference—the feature registry was rewritten in place by the 15.2.0 patch (ACTH unit only, no cohort affected) and its pre-patch hash can no longer be reproduced. The frozen snapshot with freeze manifests and per-stay outputs will be archived on Zenodo with a DOI before publication. Hardware used for all timings: 2 vCPU Intel Xeon 2.60 GHz, 2 GB RAM, Linux 6.1, Python 3.13.</w:t>
       </w:r>
     </w:p>
     <w:p>
@@ -9381,7 +9392,7 @@
         <w:jc w:val="left"/>
       </w:pPr>
       <w:r>
-        <w:t>Notes: Note 1 SAP and amendments; Table S1 engine change log C1–C16 with sources; Table S2 quarantine criteria and outcomes (rounds 1 and 2); Note 2 LLM comparison protocol; Table S3 participant flow and baseline characteristics; Note 3 fusion/Theory-of-Evidence algorithm and consistency identities; Table S4 subgroup recall; Table S5 next-test utility (engine v5.3, superseded metric); Tables S6–S6c calibration, recalibration, decision curves, multiplicity and panel-size sensitivity; Table S7 survey-weighted NHANES AUROC; Table S8 per-group calibration; Table S9 label-mapping audit (400 stays); Table S10 registry count reconciliation; Table S11 precision/F1/NDCG, alert burden, per-group PPV and prevalence baseline; Table S12 fusion-weight sensitivity; Table S12b historical comparisons (superseded); Table S13 participant flow for the UCI cohorts; Table S15 open vs proprietary components; Table S16 sepsis companion model; Note 4 regression gate; Note 5 definitions, audits and completed TRIPOD+AI checklist; Note 6 version manifest; Note 7 evidence triage of twelve proposals; Note 8 source-concordance audit; Notes 9–12 material moved from the main text; Note 13 black-box property-conformance benchmark (engine and LLM on identical perturbed panels); Note 14 executable verifier behind the LLM and verified-consensus arm; Note 15 activity-guided provenance audit; Note 16 audit study (core sufficiency, mutation testing, second LLM-written corpus); Note 18 per-rule verification ledger and its closure in registry 15.3.0; Note 19 pre-specified protocol for the independent clinical concordance audit (sample frozen, not yet executed); Table S17 reproducibility and version map; Note 17 component ablation, community survey and external cohorts (R6 §3.5–3.6 verbatim) and earlier-release eICU rows; Fig. S1 provenance audit; Fig. S2 per-release eICU metrics; Fig. S3 per-group panel-supported recall; Fig. S4 per-group calibration; Fig. S5 context-echo analysis; Fig. S6 participant flow; Data 1 per-stay outputs and LLM prompts/outputs.</w:t>
+        <w:t>Notes: Note 1 SAP and amendments; Table S1 engine change log C1–C16 with sources; Table S2 quarantine criteria and outcomes (rounds 1 and 2); Note 2 LLM comparison protocol; Table S3 participant flow and baseline characteristics; Note 3 fusion/Theory-of-Evidence algorithm and consistency identities; Table S4 subgroup recall; Table S5 next-test utility (engine v5.3, superseded metric); Tables S6–S6c calibration, recalibration, decision curves, multiplicity and panel-size sensitivity; Table S7 survey-weighted NHANES AUROC; Table S8 per-group calibration; Table S9 label-mapping audit (400 stays); Table S10 registry count reconciliation; Table S11 precision/F1/NDCG, alert burden, per-group PPV and prevalence baseline; Table S12 fusion-weight sensitivity; Table S12b historical comparisons (superseded); Table S13 participant flow for the UCI cohorts; Table S15 open vs proprietary components; Table S16 sepsis companion model; Note 4 regression gate; Note 5 definitions, audits and completed TRIPOD+AI checklist; Note 6 version manifest; Note 7 evidence triage of twelve proposals; Note 8 source-concordance audit; Notes 9–12 material moved from the main text; Note 13 black-box property-conformance benchmark (engine and LLM on identical perturbed panels); Note 14 executable verifier behind the LLM and verified-consensus arm; Note 15 activity-guided provenance audit; Note 16 audit study (core sufficiency, mutation testing, second LLM-written corpus); Note 18 per-rule verification ledger and its closure in registry 15.3.0; Note 19 pre-specified protocol for the independent clinical concordance audit (sample frozen, not yet executed); Note 20 held-out mutation test of the static detectors (pre-registered; eight new families, two seed pools); Note 21 clean-environment reproduction log; Table S17 reproducibility and version map; Table S18 two-level auditability (retrievable vs statement located) of the Note 8 sample; Note 17 component ablation, community survey and external cohorts (R6 §3.5–3.6 verbatim) and earlier-release eICU rows; Fig. S1 provenance audit; Fig. S2 per-release eICU metrics; Fig. S3 per-group panel-supported recall; Fig. S4 per-group calibration; Fig. S5 context-echo analysis; Fig. S6 participant flow; Data 1 per-stay outputs and LLM prompts/outputs.</w:t>
       </w:r>
     </w:p>
     <w:p>

</xml_diff>

<commit_message>
R9: full editorial rewrite of abstract and main text for readability (shorter sentences, topic sentences, fewer parentheticals); abstract 350 w; removed detail preserved verbatim in Note 22; no number changed; cross-refs verified
</commit_message>
<xml_diff>
--- a/docs/paper1/v7/Paper1_Hemoglyph_CMPB_EN_v7_R8.docx
+++ b/docs/paper1/v7/Paper1_Hemoglyph_CMPB_EN_v7_R8.docx
@@ -22,7 +22,7 @@
         <w:rPr>
           <w:i/>
         </w:rPr>
-        <w:t>Original research article. Revision R8 (2026-10-28), formatted for Computer Methods and Programs in Biomedicine. Research prototype — not approved or intended for clinical use.</w:t>
+        <w:t>Original research article. Revision R9 (2026-10-28), formatted for Computer Methods and Programs in Biomedicine. Research prototype — not approved or intended for clinical use.</w:t>
       </w:r>
     </w:p>
     <w:p>
@@ -178,7 +178,16 @@
         <w:t>Background and Objective:</w:t>
       </w:r>
       <w:r>
-        <w:t xml:space="preserve"> LLM-drafted clinical rule bases are validated on vignettes, rarely against their sources; clinician audit of tens of thousands is impractical. We ask what four methods—executable invariants, a frozen source-concordance protocol, a hash-frozen benchmark and an audit of the audit—establish beforehand, for Hemoglyph, an offline engine ranking a cited laboratory-panel differential with 33,183 executable rules (99.2% AI-drafted).</w:t>
+        <w:t xml:space="preserve"> An LLM-drafted clinical rule base is a set of unread hypotheses about what guidelines say; vignette validation misses mistranscription and ranking defects, and reviewing every rule is impractical. We asked what can be established </w:t>
+      </w:r>
+      <w:r>
+        <w:rPr>
+          <w:i/>
+        </w:rPr>
+        <w:t>before</w:t>
+      </w:r>
+      <w:r>
+        <w:t xml:space="preserve"> such review, for Hemoglyph, an offline engine that ranks a cited laboratory-panel differential with 33,183 rules (99.2% AI-drafted).</w:t>
       </w:r>
     </w:p>
     <w:p>
@@ -192,7 +201,7 @@
         <w:t>Methods:</w:t>
       </w:r>
       <w:r>
-        <w:t xml:space="preserve"> Property-based tests check invariants (determinism, unit invariance, monotonicity, absent analyte) on random panels, on real panels shared with an LLM, and as a verifier behind it. A frozen protocol audited 200 sampled rules against their locators, then 100 rules an activity log over 3,814 real panels shows drive output. Hash-frozen benchmarks covered the eICU-CRD demo (2,314 ICU stays), 9,000 NHANES adults, 14,420 sepsis patients and external cohorts, plus ablation and a blinded 400-stay LLM comparison. An audit study tested core sufficiency, detector mutation recall and transfer to a second corpus.</w:t>
+        <w:t xml:space="preserve"> Four pre-frozen methods: invariant tests (determinism, unit invariance, monotonicity, absent analyte) on random panels, on real panels shared with an LLM and as a verifier behind it; a source-concordance audit of 200 sampled rules, then of 100 rules an activity log over 3,814 real panels showed drive output; a hash-frozen one-shot benchmark on 2,314 ICU stays, 9,000 NHANES adults, 14,420 sepsis patients and external cohorts against supervised, prevalence and blinded LLM comparators; and an audit of the audit: core sufficiency, in-sample and held-out mutation recall, transfer to a second LLM-written corpus.</w:t>
       </w:r>
     </w:p>
     <w:p>
@@ -206,7 +215,7 @@
         <w:t>Results:</w:t>
       </w:r>
       <w:r>
-        <w:t xml:space="preserve"> The invariants exposed a ranking defect that 353 vignettes missed. Of 200 audited rules, 92% (95% CI 87.4–95.1) were unresolvable, ≥7.5% discordant. Only 364 rules (1.1%) ever drove a top-10 differential; of 100 sampled, 6 were concordant, 92 unresolvable. 60.8% (58.7–62.9) of clinician-listed ICU diagnoses ranked top-five (baseline 51.3%); sepsis prediction failed as pre-specified. Engine and LLM recall@5 did not differ detectably (60.7% vs 59.6%; +1.2 points, 95% CI −2.5 to +5.1; no equivalence margin pre-specified). SI units left engine top-5 unchanged in 40/40 panels versus 8/40; as a verifier it cut the LLM's unsupported top-5 assertions from 9.4% to 5.7% (recall@5 59.6% → 59.4%; CI −0.5 to 0.0). The 335 curated or quote-verified rules alone kept recall@3/@5 within 0.2 points (@10 −1.2); static detectors caught 74–100% of structural mutants but ≤13% of plausible wrong thresholds, and a second LLM-written corpus showed the same defects.</w:t>
+        <w:t xml:space="preserve"> The invariants exposed a ranking defect 353 vignettes had missed. Of 200 audited rules, 92% (95% CI 87.4–95.1) were unresolvable from their locators and ≥7.5% discordant. Only 364 rules (1.1%) ever drove a top-10 differential; of 100 sampled, 6 were concordant. 60.8% (58.7–62.9) of clinician-listed ICU diagnoses ranked top-five (prevalence baseline 51.3%); sepsis prediction failed as pre-specified. Engine and LLM recall@5 did not differ detectably (60.7% vs 59.6%; +1.2 points, 95% CI −2.5 to +5.1; no equivalence margin). SI units left the engine's top five unchanged in 40/40 panels, the LLM's in 8/40; as a verifier it cut the LLM's unsupported top-5 assertions from 9.4% to 5.7% for 0.2 recall points. The 335 curated or quote-verified rules alone kept recall@3/@5 within 0.2 points (@10 −1.2). Static detectors caught 74–100% of structural mutants, ≤13% of plausible wrong thresholds and almost no held-out population-gate or ±20% defects.</w:t>
       </w:r>
     </w:p>
     <w:p>
@@ -220,7 +229,7 @@
         <w:t>Conclusions:</w:t>
       </w:r>
       <w:r>
-        <w:t xml:space="preserve"> The methods are cheap, reproducible and, here, unfavourable: provenance granularity limits auditability, 1% of rules carries the output, static checks miss plausible errors. A traceable engine did not differ detectably from a frontier LLM and can verify it. No clinician audited the rules; no clinical claim is made. Code, rules, outputs and a pre-specified human-audit protocol are public.</w:t>
+        <w:t xml:space="preserve"> The methods are cheap, one-command reproducible and here unfavourable: provenance granularity limits auditability, 1% of rules carries the output, static checks miss plausible errors. A traceable engine did not differ detectably from a frontier LLM and can verify it. No clinician audited the rules and no clinical claim is made; code, rules, outputs and a human-audit protocol are public.</w:t>
       </w:r>
     </w:p>
     <w:p>
@@ -256,7 +265,7 @@
         <w:jc w:val="left"/>
       </w:pPr>
       <w:r>
-        <w:t>Roughly 70% of clinical decisions draw on laboratory results, yet interpretive comments accompany few reports and post-analytical errors remain a leading source of diagnostic harm [1–3]. Rule-based interpretation is transparent but narrow and hand-maintained [4,5]; supervised models need labelled data and cannot be audited clause by clause [6,7]; large language models (LLMs) interpret reports fluently but vary between runs, transmit patient data, and misclassify values even when reference ranges are supplied [8–11].</w:t>
+        <w:t>Roughly 70% of clinical decisions draw on laboratory results, yet few reports carry an interpretive comment and post-analytical errors remain a leading source of diagnostic harm [1–3]. Each available remedy has a known weakness. Rule-based interpretation is transparent but narrow and expensive to maintain [4,5]. Supervised models need labelled data and cannot be audited clause by clause [6,7]. Large language models (LLMs) interpret reports fluently, but their answers vary between runs, the data leave the premises, and values are misclassified even when reference ranges are supplied [8–11].</w:t>
       </w:r>
     </w:p>
     <w:p>
@@ -264,7 +273,7 @@
         <w:jc w:val="left"/>
       </w:pPr>
       <w:r>
-        <w:t>LLMs have changed one part of this picture: a guideline-transcribed rule base that once took a committee years can now be drafted in weeks. That creates a software-engineering problem: an AI-drafted rule is a hypothesis about what a source says, nobody has read most of them, and conventional validation—authors' vignettes, one institution, no comparator [12]—detects neither mistranscription nor ranking defects. Diagnostic decision-support systems have been compared with GPT-4-class models on 36–201 symptom cases [13–16], formal verification has been applied to guideline knowledge acquisition [17], and external-validation methodology for learned models is mature [18]; but no method exists for verifying a large AI-drafted laboratory rule base, and a dated search found no openly licensed, machine-executable rule set for laboratory-panel interpretation (Supplementary Note 5).</w:t>
+        <w:t>LLMs have changed one part of this picture. A guideline-transcribed rule base that once took a committee years can now be drafted in weeks. This creates a software-engineering problem rather than solving a clinical one: an AI-drafted rule is a hypothesis about what a source says, nobody has read most of them, and the usual validation—authors' vignettes, one institution, no comparator [12]—detects neither mistranscription nor ranking defects. Diagnostic decision-support systems have been compared with GPT-4-class models on 36–201 symptom cases [13–16], formal verification has been applied to guideline knowledge acquisition [17], and external validation of learned models is a mature discipline [18]. No method exists, however, for verifying a large AI-drafted laboratory rule base, and a dated search found no openly licensed, machine-executable rule set for laboratory-panel interpretation against which to compare (Supplementary Note 5).</w:t>
       </w:r>
     </w:p>
     <w:p>
@@ -272,7 +281,15 @@
         <w:jc w:val="left"/>
       </w:pPr>
       <w:r>
-        <w:t>This paper treats the rule base as software and asks how it can be verified. We contribute (i) a property-based test suite of invariants any correct laboratory-interpretation engine must satisfy, run on randomised panels, as a black box on real panels given identically to the engine and an LLM, and as a verifier behind the LLM; (ii) a source-concordance protocol, frozen before sampling, with explicit denominators, and an activity log identifying which rules actually drive output; (iii) a hash-frozen, one-shot, multi-dataset benchmark with supervised, prevalence and LLM comparators; and (iv) an audit of the audit—a sufficiency test of the audited core, mutation testing of the static detectors and their transfer to a second LLM-written corpus. Suite, protocol and detectors are engine-agnostic—they require only that a rule be expressed as analyte, operator, threshold, unit, population gate and source locator—and are released as standalone tools. The paper does not claim that the engine is accurate; it claims that it is verifiable and shows what verification finds. No clinician audited the rules: the study asks what can be established before such an audit, and releases a pre-specified protocol for it (Supplementary Note 19). The object of study is Hemoglyph, an offline single-process engine with 33,183 guideline-transcribed rules, 99.2% of them AI-drafted under a non-clinician first author and none clinically audited. The same engine ships inside a proprietary desktop product owned by the first author; this interest is declared and motivated the frozen design. Only the inference engine fed with structured analyte–value pairs is evaluated, not the optical-character-recognition front end; no clinical validation is claimed.</w:t>
+        <w:t>This paper treats the rule base as software and asks how it can be verified. We contribute four methods. (i) A property-based test suite states invariants that any correct laboratory-interpretation engine must satisfy, and runs them on randomised panels, as a black box on real panels given identically to the engine and to an LLM, and as a verifier behind the LLM. (ii) A source-concordance protocol, frozen before sampling and reported with explicit denominators, is combined with an activity log that identifies which rules actually drive the output. (iii) A hash-frozen, one-shot, multi-dataset benchmark includes supervised, prevalence and LLM comparators. (iv) An audit of the audit tests whether the audited core is sufficient, how much the static detectors see, in-sample and held-out, and whether the defects recur in a second LLM-written corpus. The suite, protocol and detectors require only that a rule be expressed as analyte, operator, threshold, unit, population gate and source locator, and are released as standalone tools.</w:t>
+      </w:r>
+    </w:p>
+    <w:p>
+      <w:pPr>
+        <w:jc w:val="left"/>
+      </w:pPr>
+      <w:r>
+        <w:t>The object of study is Hemoglyph, an offline, single-process engine with 33,183 guideline-transcribed rules, 99.2% of them AI-drafted under a non-clinician first author and none clinically audited. The same engine ships inside a proprietary desktop product owned by the first author; this interest is declared and motivated the frozen design. The paper does not claim that the engine is accurate. It claims that the engine is verifiable, shows what verification found, and releases a pre-specified protocol for the clinical audit that should follow (Supplementary Note 19). Only the inference engine, fed with structured analyte–value pairs, is evaluated; the optical-character-recognition front end is not.</w:t>
       </w:r>
     </w:p>
     <w:p>
@@ -308,7 +325,7 @@
         <w:jc w:val="left"/>
       </w:pPr>
       <w:r>
-        <w:t>Hemoglyph processes a panel in five stages (Fig. 1): normalisation (UCUM units, aliases, age/sex reference intervals, 100 derived indices); a rule layer over registry 14.1.0—33,183 executable records, each a condition on at least one analyte with a population gate, an evidence role (diagnostic criterion weight 6; supportive or screening weight 3), a disease identifier and a source locator; 24,293 (73.2%; 4,026 entities) are generated two-analyte templates ranked below diseases and citing only a generic standards page, 8,890 are attached to 2,502 disease, finding, drug-level or serology entities; an expert syndrome layer (~900 multi-analyte constellations, anchor strengths 0.95/0.88/0.80/0.72/0.45, context predicates); fixed-weight fusion (0.35 rule engine, 0.25 Bayesian, 0.20 fuzzy, 0.10 knowledge graph, 0.10 risk models; set by judgement, never tuned on evaluation data) with an expert floor (the fused score cannot fall below 0.90 × the rule-layer vote); and ranking hygiene (causal attribution, covering-diagnosis suppression, KDIGO chronicity [19], ADA glycaemic criteria [20], UDMI acuity [21], maximum 25 entries). The Bayesian layer has 75 disease nodes with hand-coded priors; no parameter was fitted to any patient record (change log in Supplementary Table S1).</w:t>
+        <w:t>Hemoglyph processes a panel in five stages (Fig. 1). Normalisation maps units (UCUM), aliases and age- and sex-specific reference intervals and computes 100 derived indices. A rule layer evaluates registry 14.1.0: 33,183 executable records, each a condition on at least one analyte with a population gate, an evidence role (diagnostic criterion, weight 6; supportive or screening, weight 3), a disease identifier and a source locator. Of these, 24,293 (73.2%) are generated two-analyte templates for 4,026 pattern entities that rank below diseases and cite only a generic standards page; 8,890 attach to 2,502 disease, finding, drug-level or serology entities. An expert syndrome layer holds about 900 multi-analyte constellations with fixed anchor strengths and context predicates. Fixed-weight fusion combines the layers (0.35 rule engine, 0.25 Bayesian, 0.20 fuzzy, 0.10 knowledge graph, 0.10 risk models; set by judgement, never tuned on evaluation data) and the fused score cannot fall below 0.90 × the rule-layer vote. Ranking hygiene applies causal attribution, covering-diagnosis suppression, KDIGO chronicity [19], ADA glycaemic criteria [20] and UDMI acuity [21], and truncates at 25 entries. The 75-node Bayesian layer has hand-coded priors. No parameter was fitted to any patient record (change log: Supplementary Table S1).</w:t>
       </w:r>
     </w:p>
     <w:p>
@@ -330,7 +347,7 @@
         <w:jc w:val="left"/>
       </w:pPr>
       <w:r>
-        <w:t xml:space="preserve">For each guideline source the first author prompted a general-purpose LLM with the source text or citation and a fixed JSON schema; returned records were accepted or rejected by automated audits only (schema validity, analyte in the 2,045-analyte feature registry, unit convertible, plausible threshold, no duplicate or contradiction, context gate present, locator resolvable) and carry the status </w:t>
+        <w:t xml:space="preserve">For each guideline source the first author prompted a general-purpose LLM with the source text or citation and a fixed JSON schema. Returned records were accepted or rejected by automated audits only—schema validity, analyte present in the 2,045-analyte feature registry, convertible unit, plausible threshold, no duplicate or contradiction, context gate present, locator resolvable—and carry the status </w:t>
       </w:r>
       <w:r>
         <w:rPr>
@@ -341,7 +358,7 @@
         <w:t>candidate_requires_specialist_validation</w:t>
       </w:r>
       <w:r>
-        <w:t>. The 272 anchor rules were written or line-edited by hand from primary guideline text. No human read the bulk; we therefore call it AI-drafted and automatically audited. Registry 14.1.0 has 33,183 rules and 785 sources.</w:t>
+        <w:t>. The 272 anchor rules were written or line-edited by hand from primary guideline text. No human read the bulk, so we call the registry AI-drafted and automatically audited. Registry 14.1.0 has 33,183 rules and 785 sources.</w:t>
       </w:r>
     </w:p>
     <w:p>
@@ -363,7 +380,7 @@
         <w:jc w:val="left"/>
       </w:pPr>
       <w:r>
-        <w:t>A property-based suite (25 tests) generates randomised panels and asserts determinism; unit invariance (SI and conventional units yield the same ranking, tolerance 10⁻³); directional monotonicity (a more extreme value never lowers the probability of the finding it defines; 14 analyte–direction pairs); absent-analyte invariance (no syndrome asserted from an analyte not present); and context invariants (documented CKD never raises acute kidney injury). It runs on every release with 353 adversarial vignettes and a safety battery, and tests logical consistency, not clinical correctness: a mistranscribed threshold passes every invariant.</w:t>
+        <w:t>A property-based suite of 25 tests generates randomised panels and asserts determinism; unit invariance (SI and conventional units give the same ranking, tolerance 10⁻³); directional monotonicity (a more extreme value never lowers the probability of the finding it defines; 14 analyte–direction pairs); absent-analyte invariance (no syndrome is asserted from an analyte that is not present); and context invariants (documented chronic kidney disease never raises acute kidney injury). It runs on every release together with 353 adversarial vignettes and a safety battery. It tests logical consistency, not clinical correctness: a mistranscribed threshold passes every invariant.</w:t>
       </w:r>
     </w:p>
     <w:p>
@@ -371,7 +388,7 @@
         <w:jc w:val="left"/>
       </w:pPr>
       <w:r>
-        <w:t xml:space="preserve">Because the same properties can be stated for any reader, four were also run as a </w:t>
+        <w:t xml:space="preserve">Because the same properties can be stated for any reader, four of them were also run as a </w:t>
       </w:r>
       <w:r>
         <w:rPr>
@@ -380,7 +397,7 @@
         <w:t>black-box</w:t>
       </w:r>
       <w:r>
-        <w:t xml:space="preserve"> benchmark in which the engine and the LLM of Section 2.5 received identical real panels: 40 eICU panels in SI units (P2), the same 40 shuffled with five normal distractors (P3), 20 panels with creatinine at ×1.0/×1.5/×2.0 (P4), and 40 panels with the defining analyte of a criterion-met diagnosis removed (P5; an assertion at rank ≤ 5 without it counts as unsupported). Panels, scorer and metrics were committed before any reading; LLM readings were blind to labels. Panels, label map, a standard-library scorer and both reference readings are released as </w:t>
+        <w:t xml:space="preserve"> benchmark in which the engine and the LLM of Section 2.5 received identical real panels: 40 eICU panels in SI units (P2); the same 40 shuffled with five normal distractors (P3); 20 panels with creatinine at ×1.0, ×1.5 and ×2.0 (P4); and 40 panels with the defining analyte of a criterion-met diagnosis removed (P5), where an assertion at rank ≤ 5 counts as unsupported. Panels, scorer and metrics were committed before any reading and the LLM read blind to labels. They are released as </w:t>
       </w:r>
       <w:r>
         <w:rPr>
@@ -389,7 +406,15 @@
         <w:t>LabPanel-Check</w:t>
       </w:r>
       <w:r>
-        <w:t xml:space="preserve">, a 290-panel conformance package on which any reader—engine or LLM—is scored with one command (Supplementary Note 13). Finally, the same criteria served as an </w:t>
+        <w:t>, a 290-panel conformance package on which any reader is scored with one command (Supplementary Note 13).</w:t>
+      </w:r>
+    </w:p>
+    <w:p>
+      <w:pPr>
+        <w:jc w:val="left"/>
+      </w:pPr>
+      <w:r>
+        <w:t xml:space="preserve">Finally, the same criteria served as an </w:t>
       </w:r>
       <w:r>
         <w:rPr>
@@ -398,7 +423,7 @@
         <w:t>executable verifier</w:t>
       </w:r>
       <w:r>
-        <w:t xml:space="preserve"> behind the LLM: each entry of the 400 stored blind readings was checked against its own panel as supported, contradicted (defining analyte present, criterion not met), analyte-absent or not verifiable; unsupported entries were demoted and recall re-scored; the engine's own top-5 passed through the same verifier. A </w:t>
+        <w:t xml:space="preserve"> behind the LLM: each entry of the 400 stored blind readings was checked against its own panel as supported, contradicted, analyte-absent or not verifiable; unsupported entries were demoted and recall re-scored, and the engine's own top five passed through the same verifier. A </w:t>
       </w:r>
       <w:r>
         <w:rPr>
@@ -407,7 +432,7 @@
         <w:t>verified consensus</w:t>
       </w:r>
       <w:r>
-        <w:t xml:space="preserve"> arm—reciprocal-rank fusion (k = 0) of the engine's ranking with the LLM entries marked supported—was registered with the rule that recall@5 below 62% would be reported as "not complementary". Protocols and predictions were committed before computation; no new LLM call was made.</w:t>
+        <w:t xml:space="preserve"> arm (reciprocal-rank fusion of the engine's ranking with the supported LLM entries) was registered with the rule that recall@5 below 62% would be reported as "not complementary" (Supplementary Note 14). No new LLM call was made.</w:t>
       </w:r>
     </w:p>
     <w:p>
@@ -435,7 +460,7 @@
         <w:t>Concordance.</w:t>
       </w:r>
       <w:r>
-        <w:t xml:space="preserve"> The protocol was frozen before sampling (seed 20261026): 100 of 272 curated anchors and 100 executable candidates (50 "eICU-relevant", 50 uniform from the rest); fields compared were analyte, operator/threshold with unit, population qualifier and disease attribution; labels CONCORDANT, DISCORDANT, UNRESOLVABLE, with the tie-break "when in doubt, unresolvable", never counted as concordant. Sources were retrieved by the registry locator, with Crossref title and PubMed abstract as fall-back for paywalled DOIs. Rates are reported with two denominators (resolvable; all sampled) and Wilson 95% CIs. The rater was an AI agent under the first author's direction, declared as such.</w:t>
+        <w:t xml:space="preserve"> The protocol was frozen before sampling (seed 20261026). We drew 100 of the 272 curated anchors and 100 executable candidates (50 relevant to the ICU label set, 50 uniform from the rest) and compared analyte, operator and threshold with unit, population qualifier and disease attribution against the source reached from the registry locator, with Crossref title and PubMed abstract as fall-back for paywalled DOIs. Labels were CONCORDANT, DISCORDANT or UNRESOLVABLE, with the tie-break "when in doubt, unresolvable"; an unresolvable rule is never counted as concordant. Rates are reported with two denominators (resolvable; all sampled) and Wilson 95% CIs. The rater was an AI agent working under the first author's direction and is declared as such.</w:t>
       </w:r>
     </w:p>
     <w:p>
@@ -449,7 +474,7 @@
         <w:t>Activity.</w:t>
       </w:r>
       <w:r>
-        <w:t xml:space="preserve"> A protocol frozen before any run (with registered expectations for core size, anchor share and audit yield) logged, for every rule on 3,814 real panels (the 2,314 eICU stays and 1,500 NHANES 2015–18 adults; seed 20261027; registry 14.2.0, whose rule layer equals v7's), whether it fired and whether its disease entered the top-10 differential. Rules that contributed at least once form the </w:t>
+        <w:t xml:space="preserve"> A second protocol, frozen with registered expectations for core size, anchor share and audit yield, logged for every rule on 3,814 real panels (the 2,314 eICU stays and 1,500 NHANES 2015–18 adults; seed 20261027) whether it fired and whether its disease entered the top-10 differential. Rules that contributed at least once form the </w:t>
       </w:r>
       <w:r>
         <w:rPr>
@@ -458,7 +483,7 @@
         <w:t>active core</w:t>
       </w:r>
       <w:r>
-        <w:t xml:space="preserve">; ≥ 10 times, the </w:t>
+        <w:t xml:space="preserve">; ten times or more, the </w:t>
       </w:r>
       <w:r>
         <w:rPr>
@@ -467,7 +492,7 @@
         <w:t>hot core</w:t>
       </w:r>
       <w:r>
-        <w:t>. Each active rule's locator was fetched and searched automatically for its threshold; then 100 active rules outside the concordance sample were drawn (seed 20261028) and labelled by the same single rater, with a verbatim quote required for every concordant or discordant verdict and strict-versus-inclusive boundary mismatches labelled discordant. No rule or locator was changed.</w:t>
+        <w:t>. Each active rule's locator was fetched and searched automatically for its threshold. Then 100 active rules outside the concordance sample were drawn (seed 20261028) and labelled by the same single rater, this time with a verbatim quote required for every concordant or discordant verdict and with strict-versus-inclusive boundary mismatches counted as discordant. No rule or locator was changed.</w:t>
       </w:r>
     </w:p>
     <w:p>
@@ -489,7 +514,7 @@
         <w:jc w:val="left"/>
       </w:pPr>
       <w:r>
-        <w:t>An internal statistical analysis plan (Supplementary Note 1; 15 dated amendments) fixed metrics, label maps, thresholds and comparators; it was hash-frozen in the repository but not publicly registered, so we write "pre-specified", not "pre-registered". Before each of two quarantine rounds, code and registry were frozen with SHA-256 manifests and quarantine data were run once. Round 1 failed two superiority criteria because a guideline-correctness change (a single creatinine no longer asserts CKD) lowered CKD recall; the criteria were re-specified as non-inferiority (Amendment 15, dated before any round-2 file was opened) and round 2 met them, so round 2 is evidence of non-regression, not the confirmatory test originally planned (Fig. 2a; Supplementary Table S2). All frozen results are for engine v7 with registry 14.1.0.</w:t>
+        <w:t>An internal statistical analysis plan (Supplementary Note 1; 15 dated amendments) fixed metrics, label maps, thresholds and comparators. It was hash-frozen in the repository but not publicly registered, so we write "pre-specified", not "pre-registered". Before each of two quarantine rounds, code and registry were frozen with SHA-256 manifests and the quarantine data were run once. Round 1 failed two superiority criteria because a guideline-correctness change (a single creatinine no longer asserts CKD) lowered CKD recall; the criteria were re-specified as non-inferiority (Amendment 15, dated before any round-2 file was opened) and round 2 met them. Round 2 is therefore evidence of non-regression, not the confirmatory test originally planned (Fig. 2a; Supplementary Table S2).</w:t>
       </w:r>
     </w:p>
     <w:p>
@@ -503,7 +528,7 @@
         <w:t>Version provenance.</w:t>
       </w:r>
       <w:r>
-        <w:t xml:space="preserve"> Every number in Tables 1, 3–5 and 7 and Figures 2 and 4–8 comes from frozen engine v7 with registry 14.1.0 (SHA-256 manifests in the repository). The black-box conformance test (Table 6; Fig. 7c; §3.7) used the released engine v8.2, because it was written after the freeze; the audit study (§2.6, §3.9) used v8.2 with registry 15.1.0, the ledger registry 15.2.0, and the ledger-driven corrections registry 15.3.0—none of these changes any v7 number. Supplementary Table S17 maps each table and figure to its engine version, registry, data file and script.</w:t>
+        <w:t xml:space="preserve"> Every number in Tables 1, 3–5 and 7 and Figures 2 and 4–8 comes from frozen engine v7 with registry 14.1.0. The black-box conformance test (Table 6) used the released engine v8.2 because it was written after the freeze; the audit study (Sections 2.6 and 3.9) used v8.2 with registries 15.1.0–15.3.0. None of these later versions changes any v7 number, and Supplementary Table S17 maps each table and figure to its engine, registry, data and script.</w:t>
       </w:r>
     </w:p>
     <w:p>
@@ -517,7 +542,7 @@
         <w:t>Datasets and reference standards</w:t>
       </w:r>
       <w:r>
-        <w:t xml:space="preserve"> (Table 2; Supplementary Table S3). eICU-CRD demo v2.0.1 [22]: 2,520 stays → 2,314 adults with ≥ 8 analytes in the first panel; reference = clinician problem list mapped to 31 groups (audit on 400 stays: precision 100%, sensitivity 98.3%). MIMIC-IV demo [23]: 235 admissions, ICD-10. NHANES 2013–14, 2015–16, 2017–18: 3,000 randomly sampled adults per cycle; references per ADA, KDIGO, WHO and ACG criteria and self-report. PhysioNet/CinC 2019 [24]: sets A/B/B2 (4,871/4,558/4,991 patients), Sepsis-3 onset. UCI thyroid0387 [25], HCV [26], ILPD [27]; 50 PMC case reports [28].</w:t>
+        <w:t xml:space="preserve"> (Table 2; Supplementary Table S3). eICU-CRD demo v2.0.1 [22]: 2,314 adult stays with at least eight analytes in the first panel, the clinician problem list mapped to 31 groups as reference (mapping audit on 400 stays: precision 100%, sensitivity 98.3%). MIMIC-IV demo [23]: 235 admissions, ICD-10. NHANES 2013–14, 2015–16 and 2017–18: 3,000 randomly sampled adults per cycle, referenced to ADA, KDIGO, WHO and ACG criteria and to self-report. PhysioNet/CinC 2019 [24]: sets A, B and B2 (14,420 patients), Sepsis-3 onset. UCI thyroid0387 [25], HCV [26], ILPD [27] and 50 PMC case reports [28].</w:t>
       </w:r>
     </w:p>
     <w:p>
@@ -531,7 +556,7 @@
         <w:t>Metrics.</w:t>
       </w:r>
       <w:r>
-        <w:t xml:space="preserve"> Primary: flat recall@k of clinician-listed diagnoses (k = 3, 5, 10). Secondary: two-tier recall; panel-supported recall (labels whose first panel met a guideline criterion fixed before scoring); per-group AUROC; false-assertion rate in all-normal adults; sepsis AUROC; calibration [29]; ablation of each component on the same 2,314 stays.</w:t>
+        <w:t xml:space="preserve"> The primary metric is flat recall@k of clinician-listed diagnoses (k = 3, 5, 10). Secondary metrics are two-tier recall, panel-supported recall (labels whose first panel met a guideline criterion fixed before scoring), per-group AUROC, the false-assertion rate in all-normal adults, sepsis AUROC, calibration [29] and a component ablation on the same 2,314 stays.</w:t>
       </w:r>
     </w:p>
     <w:p>
@@ -545,7 +570,7 @@
         <w:t>Comparators.</w:t>
       </w:r>
       <w:r>
-        <w:t xml:space="preserve"> A raw key-analyte threshold; gradient boosting and logistic regression on the same analytes (five-fold out-of-fold); a prevalence-ranking baseline; and an unnamed frontier LLM run by the authors through the Arena.ai agent platform (2026-10-21 to 2026-10-25; n = 400), which routes among several frontier model families without exposing model or version—"unnamed frontier LLM" therefore denotes a capability tier, not a verified identity. The LLM received the identical panel, age and sex with a fixed prompt requesting ten ranked diagnoses, blinded to labels; 40 panels were re-read for test–retest; scoring used the same label map and script as the engine (Supplementary Note 2).</w:t>
+        <w:t xml:space="preserve"> A raw key-analyte threshold; gradient boosting and logistic regression on the same analytes (five-fold out-of-fold); a prevalence-ranking baseline; and an unnamed frontier LLM run by the authors through the Arena.ai agent platform between 2026-10-21 and 2026-10-25 (n = 400). The platform routes among several frontier model families without exposing model or version, so "unnamed frontier LLM" denotes a capability tier, not a verified identity. The LLM received the identical panel, age and sex with a fixed prompt requesting ten ranked diagnoses, blind to labels; 40 panels were re-read for test–retest; scoring used the engine's label map and script (Supplementary Note 2).</w:t>
       </w:r>
     </w:p>
     <w:p>
@@ -559,7 +584,7 @@
         <w:t>Statistics.</w:t>
       </w:r>
       <w:r>
-        <w:t xml:space="preserve"> Labels are nested in stays (ICC 0.04); eICU proportions and paired differences use stay-cluster bootstrap (4,000 resamples) and the cluster-adjusted McNemar test [30,31]; Wilson intervals elsewhere; DeLong or bootstrap for AUROC; Benjamini–Hochberg across per-group tests. Reporting follows TRIPOD+AI [32] adapted for an unfitted system (Supplementary Note 5.7).</w:t>
+        <w:t xml:space="preserve"> Labels are nested in stays (ICC 0.04), so eICU proportions and paired differences use a stay-cluster bootstrap (4,000 resamples) and the cluster-adjusted McNemar test [30,31]; Wilson intervals are used elsewhere, DeLong or bootstrap intervals for AUROC, and Benjamini–Hochberg correction across per-group tests. Reporting follows TRIPOD+AI [32], adapted for a system with no fitted parameters (Supplementary Note 5.7).</w:t>
       </w:r>
     </w:p>
     <w:p>
@@ -581,7 +606,7 @@
         <w:jc w:val="left"/>
       </w:pPr>
       <w:r>
-        <w:t xml:space="preserve">Three questions about the methods themselves were pre-specified (protocol and detector code frozen before any result) and run on the post-audit registry 15.1.0, so no frozen number is affected. </w:t>
+        <w:t xml:space="preserve">Three questions about the methods themselves were pre-specified, with protocol and detector code frozen before any result, and run on the post-audit registry 15.1.0 so that no frozen number is affected. </w:t>
       </w:r>
       <w:r>
         <w:rPr>
@@ -590,7 +615,7 @@
         <w:t>Sufficiency</w:t>
       </w:r>
       <w:r>
-        <w:t xml:space="preserve">: an arm in which only 335 rules remain executable — the 284 curated rules, the 19 further rules that received a verbatim source quote during the active-core re-sourcing and the 32 reference-interval conventions (only 94 of the 364 active-core rules are among them) — was run on the same cohorts and seeds as the full registry; "not load-bearing" (|Δ| ≤ 0.5 points) and "partially load-bearing" (0.5–3 points) were defined in advance. </w:t>
+        <w:t xml:space="preserve">: an arm in which only 335 rules remain executable—the 284 curated rules, 19 further rules that received a verbatim source quote during re-sourcing of the active core, and 32 reference-interval conventions—was run on the same cohorts and seeds as the full registry. "Not load-bearing" (|Δ| ≤ 0.5 points) and "partially load-bearing" (0.5–3 points) were defined in advance. </w:t>
       </w:r>
       <w:r>
         <w:rPr>
@@ -599,7 +624,7 @@
         <w:t>Mutation</w:t>
       </w:r>
       <w:r>
-        <w:t xml:space="preserve">: seven static defect detectors (single ubiquitous-analyte screen, impossible severity tier, direction contradiction, unit–physiology mismatch, adult threshold applied to neonates, source-scope mismatch), calibrated on 15.1.0 and then frozen, were scored for recall on eight classes of synthetic defect injected into 303 seed rules and for specificity on the unmutated seeds. </w:t>
+        <w:t xml:space="preserve">: seven static defect detectors (single ubiquitous-analyte screen, impossible severity tier, direction contradiction, unit–physiology mismatch, adult threshold under a neonatal gate, source-scope mismatch), calibrated on 15.1.0 and then frozen, were scored for recall on eight classes of synthetic defect injected into 303 seed rules and for specificity on the unmutated seeds. Because this estimate is in-sample, a held-out test with eight further defect families was pre-registered afterwards and run on 300 AI-drafted rules of registry 15.3.0 and on the external corpus below, with the expected blind spots stated before the run (Supplementary Note 20). </w:t>
       </w:r>
       <w:r>
         <w:rPr>
@@ -608,7 +633,7 @@
         <w:t>Transfer</w:t>
       </w:r>
       <w:r>
-        <w:t>: the same detectors were run unchanged on registry 14.1.0 and on a second LLM-written rule set (200 entities × 2 rules, fixed prompt, no templates, hash-frozen before the run) written by the same agent that wrote the detectors; this tests whether the defect classes recur under a different generation process, not independence.</w:t>
+        <w:t>: the detectors were run unchanged on registry 14.1.0 and on a second LLM-written rule set (200 entities × 2 rules, fixed prompt, no templates, hash-frozen before the run). That corpus was written by the same agent that wrote the detectors, so the test asks whether the defect classes recur under a different generation process, not whether they are independent.</w:t>
       </w:r>
     </w:p>
     <w:p>
@@ -653,7 +678,7 @@
         <w:t>fell</w:t>
       </w:r>
       <w:r>
-        <w:t xml:space="preserve"> as creatinine rose from 1.6 to 2.2 mg/dL. The fix applies an existing rule uniformly and passed the full gate (eICU recall@3/5/10 48.4/61.0/74.1% versus 47.9/60.8/74.1% for v7); the frozen v7 numbers below are unchanged. The engine is deterministic (byte-identical output in 50/50 repeated stays) and runs on one CPU core in ~1 s per panel without network calls.</w:t>
+        <w:t xml:space="preserve"> as creatinine rose from 1.6 to 2.2 mg/dL. The fix applies an existing rule uniformly and passed the full gate (eICU recall@3/5/10 48.4/61.0/74.1% versus 47.9/60.8/74.1% for v7); the frozen v7 numbers reported below are unchanged. The engine is deterministic (byte-identical output in 50/50 repeated stays) and runs on one CPU core in about 1 s per panel without network calls.</w:t>
       </w:r>
     </w:p>
     <w:p>
@@ -675,18 +700,15 @@
         <w:jc w:val="left"/>
       </w:pPr>
       <w:r>
-        <w:t xml:space="preserve">Of 200 rules sampled under the frozen protocol (Fig. 3b), only 16 could be resolved from the locators the registry provides: 15 were discordant—7 attribution errors among curated anchors (e.g. a hypernatraemia rule citing the hyponatraemia guideline) and 8 thresholds or definitions absent from an on-topic source (e.g. a candidate acute-kidney-injury "criterion" defined by a fixed creatinine &gt; 1.1 mg/dL and attributed to KDIGO 2012, which defines AKI only by change from baseline)—and 1 concordant. The remaining 184 (92%, 95% CI 87.4–95.1) were unresolvable: 12 with no retrievable text, 55 with only a title or abstract, 46 citing generic methodological standards that cannot contain a disease-specific threshold, and 71 organisation landing pages. Separating retrievability from verifiability (Supplementary Table S18), 94.0% (89.8–96.5) of the sampled rules had at least one source that opened to ≥500 characters of text, but only 8.0% (5.0–12.6) had the encoded statement located in it; DOI/PMC locators were retrievable in 100% of cases yet located the statement in 10%, organisation landing pages in 0%. Because an attribution error is visible from a title while concordance needs the full text, 15/16 is not an estimate of the discordance rate; the defensible statements are that at least 7.5% (4.6–12.0) of sampled rules are demonstrably discordant and that the registry is not auditable rule-by-rule from its own locators. A provenance scan of all 785 sources resolved 112 DOIs via Crossref and reached 533 landing pages; 39 were unreachable, 34 lacked a locator, nine invalid DOIs were removed and 28 rules were flagged </w:t>
-      </w:r>
-      <w:r>
-        <w:rPr>
-          <w:rFonts w:ascii="Courier New" w:hAnsi="Courier New" w:eastAsia="Courier New" w:cs="Courier New"/>
-          <w:color w:val="000000"/>
-          <w:sz w:val="22"/>
-        </w:rPr>
-        <w:t>unverified_source</w:t>
-      </w:r>
-      <w:r>
-        <w:t xml:space="preserve"> (Supplementary Table S10, Fig. S1). The audit is single-rater, by a declared AI agent under the first author's supervision; no inter-rater reliability is claimed.</w:t>
+        <w:t>Of 200 rules sampled under the frozen protocol (Fig. 3b), only 16 could be resolved from the locators the registry provides. Fifteen of those were discordant—7 attribution errors among curated anchors (a hypernatraemia rule citing the hyponatraemia guideline, for example) and 8 thresholds or definitions absent from an on-topic source (a candidate acute-kidney-injury "criterion" defined by a fixed creatinine &gt; 1.1 mg/dL and attributed to KDIGO 2012, which defines AKI only by change from baseline)—and one was concordant. The remaining 184 (92%, 95% CI 87.4–95.1) were unresolvable: 12 with no retrievable text, 55 with only a title or abstract, 46 citing generic methodological standards that cannot contain a disease-specific threshold, and 71 organisation landing pages.</w:t>
+      </w:r>
+    </w:p>
+    <w:p>
+      <w:pPr>
+        <w:jc w:val="left"/>
+      </w:pPr>
+      <w:r>
+        <w:t>Retrievability and verifiability proved to be different properties (Supplementary Table S18): a source opened to at least 500 characters of text for 94.0% (89.8–96.5) of sampled rules, but the encoded statement was found in it for only 8.0% (5.0–12.6); DOI or PMC locators always opened yet located the statement in 10%, organisation landing pages in none. Because an attribution error is visible from a title while concordance needs the full text, 15/16 is not an estimate of the discordance rate. The defensible statements are that at least 7.5% (4.6–12.0) of sampled rules are demonstrably discordant and that the registry cannot be audited rule by rule from its own locators. A provenance scan of all 785 sources is in Supplementary Table S10 and Fig. S1. The audit is single-rater, by a declared AI agent; no inter-rater reliability is claimed.</w:t>
       </w:r>
     </w:p>
     <w:p>
@@ -708,7 +730,7 @@
         <w:jc w:val="left"/>
       </w:pPr>
       <w:r>
-        <w:t>On 3,814 real panels 1,991 rules fired and 364 (1.1%) ever placed a diagnosis in a top-10 differential (Fig. 3a); 174 did so ten or more times; 31,192 (94.0%) never fired. The active core holds 46 of the 272 curated anchors and 105 generated templates; its first-cited source is a resolved DOI for 10.4% of rules against 0.8% registry-wide. Automated search located the rule's threshold in a document reached from the locator for 8 of 364 active rules; 120 locators were organisation landing pages, 63 blocked or 404, 150 reached a page without the statement. In the fresh sample of 100 active rules, 6 were concordant (ADA 2026 diabetes and prediabetes criteria, ADA/EASD 2024 DKA severity and HHS criteria, BSG 2021 iron-deficiency anaemia), 2 discordant (an HbA1c "&gt; 5.7%" pattern against an inclusive 5.7–6.4% range; CK "≥ 1000" against "&gt; 1000 U/L" in a systematic review) and 92 unresolvable (95% CI 85.0–95.9; 88.6% among the 70 non-template rules), of which at least 18 cite a specific document that does not address the rule's analyte, 30 an organisation page and 5 a WHO URL returning 404. None of the four registered expectations was met (Supplementary Note 15).</w:t>
+        <w:t>On 3,814 real panels, 1,991 rules fired, 364 (1.1%) ever placed a diagnosis in a top-10 differential, 174 did so ten or more times, and 31,192 (94.0%) never fired (Fig. 3a). The active core holds 46 of the 272 curated anchors and 105 generated templates. Automated search located a rule's threshold in a document reached from its locator for 8 of the 364 active rules; 120 locators were organisation landing pages, 63 were blocked or returned 404, and 150 reached a page without the statement. In the fresh sample of 100 active rules, 6 were concordant (ADA 2026 diabetes and prediabetes criteria, ADA/EASD 2024 DKA severity and HHS criteria, BSG 2021 iron-deficiency anaemia), 2 discordant (an HbA1c "&gt; 5.7%" pattern against an inclusive 5.7–6.4% range; CK "≥ 1000" against "&gt; 1000 U/L") and 92 unresolvable (85.0–95.9). None of the four registered expectations was met (Supplementary Note 15).</w:t>
       </w:r>
     </w:p>
     <w:p>
@@ -730,7 +752,7 @@
         <w:jc w:val="left"/>
       </w:pPr>
       <w:r>
-        <w:t>In 2,314 adult ICU stays from 186 US hospitals, from the first panel alone, 47.9% (stay-clustered 95% CI 45.8–50.0) of 2,432 clinician-listed, laboratory-relevant diagnoses appeared in the top 3, 60.8% (58.7–62.9) in the top 5 and 74.1% (72.2–76.0) in the top 10 (Table 3). Precision@5 was 14.2% (13.3–15.2), F1@5 23.1% and NDCG@5 56.5% (54.1–58.8) against an incomplete problem list. Recall@5 ranged from 88.1% (acute myocardial infarction), 83.0% (anaemia) and 77.5% (acute kidney injury) to 49.1% (sepsis), 45.1% (diabetes) and 35.8% (CKD). A prevalence-ranking baseline reached recall@5 51.3% and NDCG@5 39.0% and overtook the engine at k = 10 (76.8% vs 74.1%): the engine's contribution is ordering, not coverage (Supplementary Table S11). Automated criterion matching of the 10,380 top-5 assertions found 14.2% on the problem list, 54.8% uncoded but criterion-positive in the same panel, 12.6% criterion-negative—the closest available estimate of false positives—and 18.4% in groups without a single-analyte criterion.</w:t>
+        <w:t>In 2,314 adult ICU stays from 186 US hospitals, using the first panel alone, 47.9% (stay-clustered 95% CI 45.8–50.0) of 2,432 clinician-listed, laboratory-relevant diagnoses appeared in the top 3, 60.8% (58.7–62.9) in the top 5 and 74.1% (72.2–76.0) in the top 10 (Table 3). Precision@5 was 14.2% (13.3–15.2), F1@5 23.1% and NDCG@5 56.5% (54.1–58.8) against an incomplete problem list. Recall@5 ranged from 88.1% for acute myocardial infarction, 83.0% for anaemia and 77.5% for acute kidney injury down to 49.1% for sepsis, 45.1% for diabetes and 35.8% for CKD. A prevalence-ranking baseline reached recall@5 51.3% and NDCG@5 39.0%, and overtook the engine at k = 10 (76.8% vs 74.1%): the engine's contribution is ordering, not coverage (Supplementary Table S11). Of the 10,380 top-5 assertions, 14.2% were on the problem list, 54.8% were uncoded but criterion-positive in the same panel, 12.6% were criterion-negative (the closest available estimate of false positives) and 18.4% fell in groups without a single-analyte criterion.</w:t>
       </w:r>
     </w:p>
     <w:p>
@@ -738,7 +760,7 @@
         <w:jc w:val="left"/>
       </w:pPr>
       <w:r>
-        <w:t>The reference standard bounds these metrics (Fig. 2b): of 2,707 label targets, 541 belonged to groups with no single laboratory criterion, 275 lacked the key analyte and 431 were contradicted by the first panel (e.g. hypokalaemia coded with potassium 4.1 mmol/L after repletion). Among the 1,460 labels whose first panel met the guideline criterion—a secondary metric defined after the ceiling was observed—flat recall was 29.6/62.5/78.0/91.8% at k = 1/3/5/10. Supervised models trained on the labels (Fig. 4) exceeded the untrained engine only in outcome-defined groups without a laboratory signature (sepsis AUROC 0.82 vs 0.68; GI bleeding 0.85 vs 0.75; alcohol withdrawal 0.80 vs 0.54) and were matched or beaten in nine guideline-defined groups.</w:t>
+        <w:t>The reference standard bounds these numbers (Fig. 2b). Of 2,707 label targets, 541 belonged to groups with no single laboratory criterion, 275 lacked the key analyte and 431 were contradicted by the first panel (hypokalaemia coded with potassium 4.1 mmol/L after repletion, for instance). Among the 1,460 labels whose first panel met the guideline criterion—a secondary metric defined after the ceiling was observed—flat recall was 29.6/62.5/78.0/91.8% at k = 1/3/5/10. Supervised models trained on the labels (Fig. 4) exceeded the untrained engine only in outcome-defined groups without a laboratory signature (sepsis AUROC 0.82 vs 0.68; gastrointestinal bleeding 0.85 vs 0.75; alcohol withdrawal 0.80 vs 0.54) and were matched or beaten in nine guideline-defined groups.</w:t>
       </w:r>
     </w:p>
     <w:p>
@@ -760,7 +782,15 @@
         <w:jc w:val="left"/>
       </w:pPr>
       <w:r>
-        <w:t>Two components carry the signal (Table 1): removing the rule-engine vote cost 12.1 points of flat recall@5 (−14.4 to −9.8) and removing the syndrome layer 9.5 points (−11.1 to −7.9); the Bayesian network contributed 1.3 points and any fusion-weight profile changed recall by ≤ 1.4 points. Restricting the registry to the 272 curated anchors (32,911 AI-drafted rules off) lowered recall@5 by 0.9 points (−2.1 to +0.2); the headline therefore rests on hand-curated components, and registry scale is not claimed as a merit. In 3,000 NHANES adults per cycle, AUROCs reproduced across the development cycle (2017–18) and the two quarantine cycles (2013–14, 2015–16): diabetes 0.946/0.938/0.924, CKD 0.959/0.968/0.962, anaemia 0.972/0.994/0.983, hypercholesterolaemia 0.905/0.883/0.886 (Fig. 5; Table 4); against self-reported physician diagnosis, which does not overlap the inputs, AUROC was 0.90–0.92 for diabetes and 0.75–0.82 for kidney disease; among guideline-healthy adults the engine asserted a disease in 2/485 (0.4%). In PhysioNet/CinC 2019 the sepsis score discriminated Sepsis-3 onset with AUROC 0.600, 0.610 and 0.588 in sets A, B and B2 versus 0.691, 0.712 and 0.679 for a supervised logistic model on the same features (Fig. 6)—a pre-specified negative result; Hemoglyph is not a sepsis predictor and was not tuned to the task afterwards. External cohorts (UCI thyroid 0.979/0.798, HCV 0.925, ILPD 0.704, MIMIC-IV demo top-5 47.5%, PMC case reports 26% specific/68% syndrome), raw-score calibration (pooled AUROC 0.797; Fig. 8) and subgroup analyses are in Table 4 and Supplementary Note 17.</w:t>
+        <w:t>Two components carry the signal (Table 1). Removing the rule-engine vote cost 12.1 points of flat recall@5 (−14.4 to −9.8) and removing the syndrome layer 9.5 points (−11.1 to −7.9); the Bayesian network contributed 1.3 points, and any fusion-weight profile changed recall by at most 1.4 points. Restricting the registry to the 272 curated anchors, with 32,911 AI-drafted rules switched off, lowered recall@5 by 0.9 points (−2.1 to +0.2). The headline therefore rests on hand-curated components, and registry scale is not claimed as a merit.</w:t>
+      </w:r>
+    </w:p>
+    <w:p>
+      <w:pPr>
+        <w:jc w:val="left"/>
+      </w:pPr>
+      <w:r>
+        <w:t>In 3,000 NHANES adults per cycle, AUROCs reproduced across the development cycle (2017–18) and the two quarantine cycles (2013–14, 2015–16): diabetes 0.946/0.938/0.924, CKD 0.959/0.968/0.962, anaemia 0.972/0.994/0.983, hypercholesterolaemia 0.905/0.883/0.886 (Fig. 5; Table 4). Against self-reported physician diagnosis, which does not overlap the inputs, AUROC was 0.90–0.92 for diabetes and 0.75–0.82 for kidney disease; among guideline-healthy adults the engine asserted a disease in 2 of 485 (0.4%). In PhysioNet/CinC 2019 the sepsis score discriminated Sepsis-3 onset with AUROC 0.600, 0.610 and 0.588 in sets A, B and B2, against 0.691, 0.712 and 0.679 for a supervised logistic model on the same features (Fig. 6). This was a pre-specified negative result; Hemoglyph is not a sepsis predictor and was not tuned to the task afterwards. External cohorts (UCI thyroid 0.979/0.798, HCV 0.925, ILPD 0.704, MIMIC-IV demo top-5 47.5%, PMC case reports 26% specific and 68% syndrome-level), raw-score calibration (pooled AUROC 0.797; Fig. 8) and subgroup analyses are in Table 4 and Supplementary Note 17.</w:t>
       </w:r>
     </w:p>
     <w:p>
@@ -782,7 +812,7 @@
         <w:jc w:val="left"/>
       </w:pPr>
       <w:r>
-        <w:t>On 400 stays (291 with scorable labels; 596 labels), recall@5—the pre-specified primary comparison—was 60.7% (56.5–65.0) for Hemoglyph versus 59.6% (55.3–63.6) for the LLM, difference +1.2 points (−2.5 to +5.1; cluster-adjusted McNemar p = 0.54). The LLM was better at rank 1 (28.2% vs 24.0%, p = 0.013) and rank 3 (50.8% vs 47.0%, p = 0.041); the engine at rank 10 (72.0% vs 65.1%, p = 0.0002) and left fewer labels absent (21.8% vs 34.9%); mean reciprocal rank 0.391 vs 0.408 (Fig. 7; Table 5). On 40 panels re-read by the LLM, top-5 agreement with its own first reading was κ 0.69; the engine's was 1.00.</w:t>
+        <w:t>On 400 stays (291 with scorable labels; 596 labels), recall@5—the pre-specified primary comparison—was 60.7% (56.5–65.0) for Hemoglyph and 59.6% (55.3–63.6) for the LLM, a difference of +1.2 points (−2.5 to +5.1; cluster-adjusted McNemar p = 0.54). The LLM was better at rank 1 (28.2% vs 24.0%, p = 0.013) and rank 3 (50.8% vs 47.0%, p = 0.041); the engine was better at rank 10 (72.0% vs 65.1%, p = 0.0002) and left fewer labels absent altogether (21.8% vs 34.9%); mean reciprocal rank was 0.391 vs 0.408 (Fig. 7; Table 5). On 40 panels re-read by the LLM, top-5 agreement with its own first reading was κ 0.69; the engine's was 1.00.</w:t>
       </w:r>
     </w:p>
     <w:p>
@@ -804,7 +834,7 @@
         <w:jc w:val="left"/>
       </w:pPr>
       <w:r>
-        <w:t>Table 6 reports four properties run on both systems. SI units left the engine's top-5 identical in 40/40 panels (Jaccard 1.00) and the LLM's in 8/40 (0.72); shuffled order with distractors, 35/40 (0.96) versus 10/40 (0.73). The LLM figures are measured against its first reading and so include its test–retest variability (κ 0.69). The first engine run gave 36/40 on SI units; all four discrepancies traced to one defect the in-process suite had not reached—a record mirrored under a legacy identifier kept its reported unit, so a normal bilirubin of 9 µmol/L met an 8 mg/dL panic threshold. The fix has a regression test; the frozen v7 numbers are untouched. Re-scored through the released package with registry 15.2.0, the engine card is unchanged except P2 39/40: in the one discordant pair the generator's rounding (1.3 mg/dL → 115 µmol/L → 1.3009 mg/dL) crosses a strict &gt; 1.3 mg/dL rule leaf, a generator artefact, not a unit defect. The engine violated creatinine monotonicity in 2/20 ladders at ×2.0 (logged, not changed; the LLM's 0/20 is not blind because the step was visible). After removal of the defining analyte, the target remained at rank ≤ 5 in 3/40 engine and 14/40 LLM panels (1/29 versus 4/29 with no redundant analyte left, post hoc). In a blinded NHANES test the engine asserted no disease in 40 guideline-healthy adults and the LLM four (Supplementary Note 13).</w:t>
+        <w:t>Table 6 reports the four properties run on both systems. SI units left the engine's top five identical in 40/40 panels (Jaccard 1.00) and the LLM's in 8/40 (0.72); shuffled order with distractors, 35/40 (0.96) against 10/40 (0.73). The LLM figures are measured against its own first reading and therefore include its test–retest variability. The first engine run gave 36/40 on SI units; all four discrepancies traced to one defect the in-process suite had not reached—a record mirrored under a legacy identifier kept its reported unit, so a normal bilirubin of 9 µmol/L met an 8 mg/dL panic threshold. The fix has a regression test and the frozen v7 numbers are untouched. The engine violated creatinine monotonicity in 2 of 20 ladders at ×2.0 (logged, not changed; the LLM's 0/20 is not blind because the step was visible). After removal of the defining analyte, the target remained at rank ≤ 5 in 3/40 engine and 14/40 LLM panels. In a blinded NHANES test the engine asserted no disease in 40 guideline-healthy adults; the LLM did so in four (Supplementary Note 13).</w:t>
       </w:r>
     </w:p>
     <w:p>
@@ -818,7 +848,7 @@
           <w:i w:val="0"/>
           <w:color w:val="000000"/>
         </w:rPr>
-        <w:t>3.8 The engine's criteria as a verifier behind the LLM, and a pre-specified negative result</w:t>
+        <w:t>3.8 The engine's criteria as a verifier behind the LLM</w:t>
       </w:r>
     </w:p>
     <w:p>
@@ -826,7 +856,7 @@
         <w:jc w:val="left"/>
       </w:pPr>
       <w:r>
-        <w:t>Of 2,424 LLM entries, 1,636 mapped to a group with a criterion (1,439 supported, 182 contradicted, 15 analyte-absent); 788 were not verifiable (Table 7). Among mapped top-5 entries 140/1,486 (9.4%) were unsupported (registered expectation 15–30%); the engine's own top-5 failed the same proxy criteria in 233/1,518 (15.3%; registered 5–15%), mostly where its hyperglycaemia and prerenal rules are more permissive than the criterion, but never without the analyte (0/1,518). Demoting unsupported LLM entries left recall@5 unchanged (59.6 → 59.4%; paired −0.2, 95% CI −0.5 to 0.0), raised recall@1 by 1.2 points (CI 0.2–2.3, p = 0.014) and reduced the unsupported share to 5.7%; of 197 demoted entries 10 were clinician labels (5.1%; registered ≤ 10%; Supplementary Note 14). The parameter-free fusion of the engine's ranking with the supported LLM entries gave recall@1/5/10 of 21.8/61.2/76.3%: below the registered 62% at rank 5 (+0.6 versus the engine, CI −2.2 to 3.4), worse than both at rank 1, better only at rank 10 (+4.5, CI 2.2–6.8) and on criterion-met labels (82.1% versus 77.9/81.0%), while outcome-type labels fell from 51.9% to 42.7%: the filter admits only the verifiable, so constellation-ranked syndromes are displaced. Per protocol the systems are reported as not complementary; no other rule was tried.</w:t>
+        <w:t>Of 2,424 LLM entries, 1,636 mapped to a group with a criterion (1,439 supported, 182 contradicted, 15 analyte-absent) and 788 were not verifiable (Table 7). Among mapped top-5 entries, 140 of 1,486 (9.4%) were unsupported, below the registered expectation of 15–30%. The engine's own top five failed the same proxy criteria in 233 of 1,518 (15.3%; registered 5–15%), mostly where its hyperglycaemia and prerenal rules are more permissive than the criterion, but never without the analyte present (0/1,518). Demoting unsupported LLM entries left recall@5 essentially unchanged (59.6% → 59.4%; paired −0.2, 95% CI −0.5 to 0.0), raised recall@1 by 1.2 points (0.2–2.3; p = 0.014) and reduced the unsupported share to 5.7%; of 197 demoted entries, 10 were clinician labels (5.1%; registered ≤ 10%; Supplementary Note 14). The parameter-free fusion of the engine's ranking with the supported LLM entries gave recall@1/5/10 of 21.8/61.2/76.3%: below the registered 62% at rank 5, worse than both systems at rank 1, better only at rank 10 (+4.5, CI 2.2–6.8), and worse on outcome-type labels (51.9% → 42.7%) because the filter admits only what is verifiable. Per protocol the systems are reported as not complementary; no other rule was tried.</w:t>
       </w:r>
     </w:p>
     <w:p>
@@ -854,25 +884,7 @@
         <w:t>Sufficiency.</w:t>
       </w:r>
       <w:r>
-        <w:t xml:space="preserve"> With only the 335 curated, quote-verified or convention rules executable, eICU flat recall@3/@5/@10 was 47.8/61.2/73.1% against 48.0/61.2/74.3% for the full 15.1.0 registry, two-tier recall@1/@3/@5 32.3/60.9/70.1% against 33.3/62.3/72.4%, mean per-label AUROC 0.761 against 0.766, with NHANES AUROCs identical and healthy-adult false assertions 0/51 in both arms. Paired differences were significant only at @10 (p = 0.005; grouped@10 p = 3.8 × 10⁻⁵), driven by diabetes and renal pattern templates: under the pre-stated thresholds the other 30,735 executable rules are not load-bearing at @3/@5 and partially load-bearing at @10 and in the two-tier metric. </w:t>
-      </w:r>
-      <w:r>
-        <w:rPr>
-          <w:i/>
-        </w:rPr>
-        <w:t>Mutation.</w:t>
-      </w:r>
-      <w:r>
-        <w:t xml:space="preserve"> (Fig. 3c) Detector recall was 1.00 for inverted or impossible tiers (301/301), 0.98 for multi-analyte rules collapsed to a single ubiquitous analyte (138/141), 0.74 for unit substitution (113/152), 0.55 for thresholds pushed outside physiological limits (40/73), 0.46 for random source substitution (40/88), 0.13 for operator flips (36/274) and 0.003 for plausible threshold changes (1/303); specificity on unmutated seeds was 0.974, and four of the eight flagged seeds were real defects (an adult haemoglobin threshold under a neonatal population gate). These, with 126 unit-label and 14 source errors found during calibration, were corrected in registry 15.2.0 under a written protocol, with every eICU and NHANES gate count identical before and after. Because these recalls were measured on the registry the detectors were tuned on, a held-out test with eight new mutation families was pre-registered and run afterwards on 300 AI-drafted rules of registry 15.3.0 and on the 400-rule external corpus (Supplementary Note 20): unit-swap recall held (0.81 and 0.70), operator-flip recall fell to 0.035 on the sparse external corpus, decimal-place errors were caught in 13–16%, a benign unit conversion was never flagged, and—as pre-stated—removing a population gate, swapping in a same-domain source, encoding a contradictory conjunction or shifting a threshold by 20% were missed in ≥98% of cases. </w:t>
-      </w:r>
-      <w:r>
-        <w:rPr>
-          <w:i/>
-        </w:rPr>
-        <w:t>Transfer.</w:t>
-      </w:r>
-      <w:r>
-        <w:t xml:space="preserve"> Per 100 rules, any-detector density was 23.6 (95% CI 22.8–24.5) in registry 14.1.0 (dominated by template classes release 15 retired), 1.3 (1.0–1.6) in 15.1.0 (the calibration set) and 12.8 (9.8–16.4) in the second LLM-written corpus, where single-analyte screens (6.0) and adult thresholds without a population gate (3.3) predominated; 37 of 51 flags were true defects, 8 false positives and 6 undetermined (Supplementary Note 16).</w:t>
+        <w:t xml:space="preserve"> With only the 335 curated, quote-verified or convention rules executable, eICU flat recall@3/5/10 was 47.8/61.2/73.1% against 48.0/61.2/74.3% for the full registry 15.1.0, two-tier recall@1/3/5 was 32.3/60.9/70.1% against 33.3/62.3/72.4%, mean per-label AUROC 0.761 against 0.766, NHANES AUROCs were identical and healthy-adult false assertions were 0/51 in both arms. Paired differences were significant only at @10 (p = 0.005), driven by diabetes and renal pattern templates. Under the pre-stated thresholds the other 30,735 executable rules are not load-bearing at @3 and @5, and partially load-bearing at @10 and in the two-tier metric.</w:t>
       </w:r>
     </w:p>
     <w:p>
@@ -883,21 +895,52 @@
         <w:rPr>
           <w:i/>
         </w:rPr>
+        <w:t>Mutation.</w:t>
+      </w:r>
+      <w:r>
+        <w:t xml:space="preserve"> In-sample detector recall (Fig. 3c) was 1.00 for inverted or impossible tiers (301/301), 0.98 for multi-analyte rules collapsed to a single ubiquitous analyte (138/141), 0.74 for unit substitution (113/152), 0.55 for thresholds pushed outside physiological limits (40/73), 0.46 for random source substitution (40/88), 0.13 for operator flips (36/274) and 0.003 for plausible threshold changes (1/303); specificity on unmutated seeds was 0.974, and four of the eight flagged seeds were real defects. These, with 126 unit-label and 14 source errors found during calibration, were corrected in registry 15.2.0 under a written protocol, with every eICU and NHANES gate count identical before and after. The held-out test (Supplementary Note 20) then showed where the in-sample figures hold and where they do not: unit-swap recall held at 0.81 on the 300 AI-drafted rules and 0.70 on the external corpus, but operator-flip recall fell to 0.035 on the external corpus, whose two-rules-per-entity structure gives the direction detector nothing to compare against; decimal-place errors (×10, ÷10) were caught in 13–16%; a benign, consistent unit conversion was never flagged; and, as pre-stated, removing a population gate, swapping in a same-domain source, encoding a contradictory conjunction or shifting a threshold by 20% went undetected in at least 98% of cases.</w:t>
+      </w:r>
+    </w:p>
+    <w:p>
+      <w:pPr>
+        <w:jc w:val="left"/>
+      </w:pPr>
+      <w:r>
+        <w:rPr>
+          <w:i/>
+        </w:rPr>
+        <w:t>Transfer.</w:t>
+      </w:r>
+      <w:r>
+        <w:t xml:space="preserve"> Per 100 rules, any-detector density was 23.6 (95% CI 22.8–24.5) in registry 14.1.0, 1.3 (1.0–1.6) in 15.1.0 and 12.8 (9.8–16.4) in the second LLM-written corpus, where 37 of 51 flags were true defects (Supplementary Note 16).</w:t>
+      </w:r>
+    </w:p>
+    <w:p>
+      <w:pPr>
+        <w:jc w:val="left"/>
+      </w:pPr>
+      <w:r>
+        <w:rPr>
+          <w:i/>
+        </w:rPr>
         <w:t>Ledger.</w:t>
       </w:r>
       <w:r>
-        <w:t xml:space="preserve"> A per-rule verification ledger (Fig. 3d; Supplementary Note 18; </w:t>
-      </w:r>
+        <w:t xml:space="preserve"> A per-rule verification ledger (Fig. 3d; Supplementary Note 18) joins the four methods, without new measurement, for the 605 curated, active-core or sufficiency-arm rules. Of the 272 anchors, 18 are quote-verified, 8 carry a discordant verdict, 101 cite a reachable but unchecked source and 141 are unresolvable; of the 364 active-core rules, 145 were retired, 37 are quote-verified and 157 unresolvable. The ledger also exposed seven discordant rules, five open detector flags and one unimplemented protocol line that had been left unchanged; all were closed under a written protocol in registry 15.3.0 with the non-regression gate unchanged on every primary metric.</w:t>
+      </w:r>
+    </w:p>
+    <w:p>
+      <w:pPr>
+        <w:jc w:val="left"/>
+      </w:pPr>
       <w:r>
         <w:rPr>
-          <w:rFonts w:ascii="Courier New" w:hAnsi="Courier New" w:eastAsia="Courier New" w:cs="Courier New"/>
-          <w:color w:val="000000"/>
-          <w:sz w:val="22"/>
+          <w:i/>
         </w:rPr>
-        <w:t>eval/verification_ledger/build_ledger.py</w:t>
-      </w:r>
-      <w:r>
-        <w:t>) joins the four methods, without any new measurement, for the 605 rules that are curated, active-core or sufficiency-arm members, and assigns each one label under a fixed precedence. Of the 272 anchors, 18 are quote-verified, 8 carry a discordant verdict (6 uncorrected), 101 cite a reachable but unchecked source and 141 are unresolvable or sampled as such; of the 364 active-core rules, 145 were retired under the 15.0.0 protocol, 37 are quote-verified and 157 unresolvable; the executable invariants reach the analyte of 104 of the 219 active-core rules still executable. Seven rules with a recorded discordant verdict and five with an open detector flag were unchanged in 15.2.0; under a written protocol (registry 15.3.0) two were re-sourced with retrieved quotes, two reclassified as reference-interval conventions, two retired, one boundary written, and the five flags inspected and left in place as recorded exceptions; the ledger also exposed one unimplemented line of the 15.0.0 protocol (a missing HbA1c upper bound). The non-regression gate was unchanged on every primary metric (eICU flat and two-tier recall identical; NHANES AUROCs identical; grouped recall@1 −0.3 points).</w:t>
+        <w:t>Reproduction.</w:t>
+      </w:r>
+      <w:r>
+        <w:t xml:space="preserve"> From a clean clone of the repository, one command rebuilt engine v7 from its git tag, checked it against the freeze manifests, re-ran the tests, the ledger, the mutation table and the frozen engine on NHANES and eICU, and reproduced every number in Tables 3 and 4 exactly (Supplementary Note 21). The first attempt failed because two inputs of the ledger existed only in the authors' working copy; they were committed and the run repeated.</w:t>
       </w:r>
     </w:p>
     <w:p>
@@ -919,7 +962,7 @@
         <w:jc w:val="left"/>
       </w:pPr>
       <w:r>
-        <w:t>Each method produced information that conventional validation had not: two engine defects that 353 adversarial vignettes missed; a rule base that cannot be audited from its own locators, with at least 7.5% of sampled rules discordant; an output carried by 1.1% of rules that fail in the same way as the bulk; recall@5 not detectably different from a frontier LLM (no equivalence margin was pre-specified) while a prevalence baseline reached 51%, so the engine's contribution is ordering (NDCG@5 56.5% vs 39.0%) and specificity, not coverage; and an audit of the audit showing that 335 curated or quote-verified rules preserve recall@3/@5 (|Δ| ≤ 0.2 points) while reducing recall@10 by 1.2 points, that static detectors catch structural but not plausible defects, and that a second LLM-written rule set shows the same defect classes.</w:t>
+        <w:t>Each method produced information that conventional validation had not. The invariants found two engine defects that 353 adversarial vignettes had missed. The concordance audit found a rule base that cannot be audited from its own locators, with at least 7.5% of sampled rules discordant. The activity log found an output carried by 1.1% of the rules, which fail in the same way as the bulk. The benchmark found recall@5 not detectably different from a frontier LLM while a prevalence baseline reached 51%, so the engine's contribution is ordering (NDCG@5 56.5% vs 39.0%) and specificity rather than coverage. The audit of the audit found that 335 curated or quote-verified rules preserve recall@3 and @5 within 0.2 points at a cost of 1.2 points at @10, and that static detectors catch structural but not plausible defects.</w:t>
       </w:r>
     </w:p>
     <w:p>
@@ -927,7 +970,7 @@
         <w:jc w:val="left"/>
       </w:pPr>
       <w:r>
-        <w:t xml:space="preserve">Executable invariants are a genuine advantage of a rule engine over an LLM: they can be stated, run on every release and violated only visibly. On identical panels the engine held unit and presentation invariance where the LLM's output changed in most panels, and the same test found two engine defects—a violated invariant is a bug report with a reproducer, whereas an LLM's changed answer is not actionable. The criteria also work as a verifier </w:t>
+        <w:t xml:space="preserve">Executable invariants are a genuine advantage of a rule engine over an LLM. They can be stated, run on every release and violated only visibly. On identical panels the engine held unit and presentation invariance where the LLM's output changed in most panels, and the same test found two engine defects: a violated invariant is a bug report with a reproducer, whereas an LLM's changed answer is not actionable. The criteria also work as a verifier </w:t>
       </w:r>
       <w:r>
         <w:rPr>
@@ -936,7 +979,7 @@
         <w:t>behind</w:t>
       </w:r>
       <w:r>
-        <w:t xml:space="preserve"> the LLM, reducing its unsupported top-5 assertions from 9.4% to 5.7% while recall@5 changed by −0.2 points (95% CI −0.5 to 0.0); fusing the two did not help at rank 5, because filtering admits only the verifiable while the engine's residual advantage lies in outcome syndromes no single criterion verifies. Invariants establish consistency, not correctness: a mistranscribed threshold passes every invariant (mutation recall 0.003 for a plausible wrong number). The concordance audit shows why correctness is hard to reach: the limiting factor was locator granularity, not rater effort—organisation-level URLs and generic standards make 92% of rules uncheckable, and where checking was possible the error was usually attribution. Audit protocols should therefore require the verbatim source sentence for every verdict, registries should carry section- or table-level locators, and an independent clinical audit is the next step, and its protocol—50 active-core and 50 anchor rules, two blinded clinical raters, verbatim-quote verdicts, Cohen's κ, sample size and stopping rule—is fixed in Supplementary Note 19 before any rater is recruited. All four tools transfer unchanged to any rule base whose records carry analyte, operator, threshold, unit, population and locator.</w:t>
+        <w:t xml:space="preserve"> the LLM, reducing its unsupported top-5 assertions from 9.4% to 5.7% for a change in recall@5 of −0.2 points. Fusing the two systems did not help at rank 5, because filtering admits only the verifiable while the engine's residual advantage lies in outcome syndromes that no single criterion verifies. Invariants establish consistency, not correctness, and the held-out mutation test now bounds how little else the static layer sees: a wrong but plausible number, a missing population gate or a wrong-but-on-topic citation passes it.</w:t>
       </w:r>
     </w:p>
     <w:p>
@@ -944,7 +987,23 @@
         <w:jc w:val="left"/>
       </w:pPr>
       <w:r>
-        <w:t>The benchmark numbers measure the reference standard at least as much as the engine. A quarter of problem-list entries were not inferable from the first panel; the panel-supported subset is recovered at 78.0% (k = 5) and 91.8% (k = 10), supervised models did not exceed 0.82 AUROC for outcome-defined groups, and a prevalence baseline overtakes any method at k = 10. Of the 85.8% of top-5 assertions not on the problem list, 54.8% satisfy the group's criterion in the same panel and only 12.6% are criterion-negative—coded precision (14.2%) is a lower bound, 69.0% an upper bound. Where the engine loses (sepsis, bleeding, withdrawal, CKD without a second creatinine) the label is an outcome learned from hidden correlates or needs longitudinal data; part of the loss was chosen, since withdrawing single-creatinine CKD assertions to comply with KDIGO cost three points of recall@5. Ablation and sufficiency agree that the result lives in the rule vote and a few hundred curated constellations; the bulk adds one to three points and 94% of it never fired, so the activity log converts an unauditable registry into a tractable verification queue. A practical consequence is that a release could ship only the 335 verified rules, with the remaining 30,735 executable rules carried as labelled, off-by-default hypotheses until each is audited; the sufficiency arm shows this would cost ≤ 0.2 points at @3/@5 and 1.2 points at @10. The design answers criticisms of recent LLM benchmarks—unstable metrics, leakage and post-hoc selection [28,33]: releases were frozen with manifests, quarantine data were run once, the failed round is disclosed, and the LLM's test–retest variability (κ 0.69) exceeded the between-system difference. Unlike Isabel and DXplain studies [13–16,34], this study isolates laboratory-only reasoning on more than 20,000 encounters and releases its knowledge base under an open licence; the per-entry rule identifier and source are consistent with the transparency principle of the FDA's January 2026 clinical-decision-support guidance, without any regulatory claim.</w:t>
+        <w:t>The concordance audit shows why correctness is hard to reach. The limiting factor was locator granularity, not rater effort: organisation-level URLs and generic standards make 92% of rules uncheckable, and where checking was possible the error was usually attribution. Three practical consequences follow. Audit protocols should require the verbatim source sentence for every verdict; registries should carry section- or table-level locators; and an independent clinical audit is the next step, for which the protocol—50 active-core and 50 anchor rules, two blinded clinical raters, verbatim-quote verdicts, Cohen's κ, sample size and stopping rule—is fixed in Supplementary Note 19 before any rater is recruited.</w:t>
+      </w:r>
+    </w:p>
+    <w:p>
+      <w:pPr>
+        <w:jc w:val="left"/>
+      </w:pPr>
+      <w:r>
+        <w:t>The benchmark numbers measure the reference standard at least as much as the engine. A quarter of problem-list entries were not inferable from the first panel, the panel-supported subset is recovered at 78.0% (k = 5) and 91.8% (k = 10), and a prevalence baseline overtakes any method at k = 10. Because 54.8% of the top-5 assertions absent from the problem list satisfy the group's criterion in the same panel and only 12.6% are criterion-negative, coded precision (14.2%) is a lower bound and 69.0% an upper bound. Where the engine loses—sepsis, bleeding, withdrawal, CKD without a second creatinine—the label is an outcome learned from hidden correlates or needs longitudinal data, and part of the loss was chosen: withdrawing single-creatinine CKD assertions to comply with KDIGO cost three points of recall@5.</w:t>
+      </w:r>
+    </w:p>
+    <w:p>
+      <w:pPr>
+        <w:jc w:val="left"/>
+      </w:pPr>
+      <w:r>
+        <w:t>Ablation and sufficiency agree that the result lives in the rule vote and a few hundred curated constellations. The bulk adds one to three points and 94% of it never fired, so the activity log converts an unauditable registry into a tractable verification queue: a release could ship only the 335 verified rules and carry the remaining 30,735 as labelled, off-by-default hypotheses until each is audited, at a measured cost of at most 0.2 points at @3 and @5 and 1.2 points at @10. The design also answers the criticisms made of recent LLM benchmarks—unstable metrics, leakage and post-hoc selection [28,33]: releases were frozen with manifests, quarantine data were run once, the failed round is disclosed, the whole chain reproduces from a clean clone, and the LLM's own test–retest variability (κ 0.69) exceeded the between-system difference. Unlike the Isabel and DXplain studies [13–16,34], this study isolates laboratory-only reasoning on more than 20,000 encounters and releases its knowledge base under an open licence; the per-entry rule identifier and source are consistent with the transparency principle of the FDA's January 2026 clinical-decision-support guidance, without any regulatory claim being made.</w:t>
       </w:r>
     </w:p>
     <w:p>
@@ -966,7 +1025,7 @@
         <w:jc w:val="left"/>
       </w:pPr>
       <w:r>
-        <w:t>No clinician audited the rules or adjudicated outputs; both concordance audits are single-rater, by a declared AI agent, without inter-rater reliability, so the concordance estimates are provisional until the protocol in Supplementary Note 19 is executed. The LLM comparison tested superiority, not equivalence; p = 0.54 does not establish parity. Nearly three quarters of the executable rules are generated two-analyte templates citing a generic standards page; "dormant" means dormant on the analyte coverage of the two corpora used. The components that carry the result were written by a non-clinician first author; 34 sources lack a locator; Bayesian priors are hand-coded without a per-value citation table; no version-control history exists for the development period. Only the open demo subsets of eICU and MIMIC-IV were used, with problem lists and ICD codes as reference standards. The LLM comparison is an author-run self-baseline through a platform that does not disclose the model, without retrieval augmentation or clinician adjudication, and the model's training data may include the public eICU demo. Quarantine criteria were weakened after round 1; the panel-supported metric is post hoc; NHANES laboratory-defined labels overlap the inputs; raw scores are uncalibrated; external cohorts are small; the OCR front end, Iranian populations and non-English laboratory conventions were not evaluated. The verifier's criteria are proxies and its synonym map is coarse, so its verdicts bound rather than measure unsupported assertion. The static detectors were calibrated on the registry they then scored (the held-out test of Supplementary Note 20 bounds the resulting optimism for two families and confirms blindness to population-gate, same-domain-source, contradictory-conjunction and ±20% threshold defects), and the second LLM-written corpus was produced by the same agent that wrote them. The first author is a secondary-school student with a financial interest in the commercial product, and the system, including 99.2% of the rules, was developed with AI-agent assistance. Hemoglyph is a research prototype with no regulatory clearance.</w:t>
+        <w:t>No clinician audited the rules or adjudicated outputs. Both concordance audits are single-rater, by a declared AI agent, without inter-rater reliability, so the concordance estimates are provisional until the protocol in Supplementary Note 19 is executed. The LLM comparison tested superiority, not equivalence (p = 0.54 does not establish parity); it is an author-run self-baseline through a platform that does not disclose the model, without retrieval augmentation or clinician adjudication, on a public dataset the model may have seen in training. Nearly three quarters of the executable rules are generated two-analyte templates citing a generic standards page, and "dormant" means dormant on the analyte coverage of the two corpora used. The components that carry the result were written by a non-clinician first author; 34 sources lack a locator; Bayesian priors are hand-coded without a per-value citation table; no version-control history exists for the development period. Only the open demo subsets of eICU and MIMIC-IV were used, with problem lists and ICD codes as reference standards; quarantine criteria were weakened after round 1; the panel-supported metric is post hoc; NHANES laboratory-defined labels overlap the inputs; raw scores are uncalibrated; external cohorts are small; the OCR front end, Iranian populations and non-English laboratory conventions were not evaluated. The verifier's criteria are proxies with a coarse synonym map, so its verdicts bound rather than measure unsupported assertion. The static detectors were calibrated on the registry they then scored and the second LLM-written corpus was written by the same agent; the held-out test bounds the resulting optimism for two defect families and confirms blindness to four others. The first author is a secondary-school student with a financial interest in the commercial product, and the system, including 99.2% of the rules, was developed with AI-agent assistance. Hemoglyph is a research prototype with no regulatory clearance.</w:t>
       </w:r>
     </w:p>
     <w:p>
@@ -988,7 +1047,7 @@
         <w:jc w:val="left"/>
       </w:pPr>
       <w:r>
-        <w:t>Executable invariants, a frozen source-concordance protocol with an activity log, a hash-frozen one-shot benchmark and an audit of the audit are four low-cost, reproducible methods for verifying an AI-drafted clinical rule base; a rule engine whose every output carries a rule identifier, threshold and source can be audited in ways a language model cannot, and can audit the language model's output in turn. Applied to Hemoglyph they found defects that vignettes had missed, showed that provenance granularity rather than rule count limits auditability, that 1.1% of the rules carry the output and that 335 curated or quote-verified rules alone preserve recall@5 while reducing recall@10 by 1.2 points, that static checks cannot catch a plausible wrong number, and showed an untrained, traceable engine not detectably different from a frontier LLM close to the ceiling the reference standard allows. The limits—an unaudited rule base, outcome-defined syndromes, uncalibrated scores—are stated so that they can be measured and closed.</w:t>
+        <w:t>Executable invariants, a frozen source-concordance protocol with an activity log, a hash-frozen one-shot benchmark and an audit of the audit are four low-cost, reproducible methods for verifying an AI-drafted clinical rule base. A rule engine whose every output carries a rule identifier, threshold and source can be audited in ways a language model cannot, and can audit the language model's output in turn. Applied to Hemoglyph, the methods found defects that vignettes had missed; showed that provenance granularity, not rule count, limits auditability; showed that 1.1% of the rules carry the output and that 335 curated or quote-verified rules alone preserve recall@5 at a cost of 1.2 points at @10; showed that static checks cannot catch a plausible wrong number; and showed an untrained, traceable engine performing within the ceiling the reference standard allows and not detectably differently from a frontier LLM. The limits—an unaudited rule base, outcome-defined syndromes, uncalibrated scores—are stated so that they can be measured and closed.</w:t>
       </w:r>
     </w:p>
     <w:p>
@@ -9392,7 +9451,7 @@
         <w:jc w:val="left"/>
       </w:pPr>
       <w:r>
-        <w:t>Notes: Note 1 SAP and amendments; Table S1 engine change log C1–C16 with sources; Table S2 quarantine criteria and outcomes (rounds 1 and 2); Note 2 LLM comparison protocol; Table S3 participant flow and baseline characteristics; Note 3 fusion/Theory-of-Evidence algorithm and consistency identities; Table S4 subgroup recall; Table S5 next-test utility (engine v5.3, superseded metric); Tables S6–S6c calibration, recalibration, decision curves, multiplicity and panel-size sensitivity; Table S7 survey-weighted NHANES AUROC; Table S8 per-group calibration; Table S9 label-mapping audit (400 stays); Table S10 registry count reconciliation; Table S11 precision/F1/NDCG, alert burden, per-group PPV and prevalence baseline; Table S12 fusion-weight sensitivity; Table S12b historical comparisons (superseded); Table S13 participant flow for the UCI cohorts; Table S15 open vs proprietary components; Table S16 sepsis companion model; Note 4 regression gate; Note 5 definitions, audits and completed TRIPOD+AI checklist; Note 6 version manifest; Note 7 evidence triage of twelve proposals; Note 8 source-concordance audit; Notes 9–12 material moved from the main text; Note 13 black-box property-conformance benchmark (engine and LLM on identical perturbed panels); Note 14 executable verifier behind the LLM and verified-consensus arm; Note 15 activity-guided provenance audit; Note 16 audit study (core sufficiency, mutation testing, second LLM-written corpus); Note 18 per-rule verification ledger and its closure in registry 15.3.0; Note 19 pre-specified protocol for the independent clinical concordance audit (sample frozen, not yet executed); Note 20 held-out mutation test of the static detectors (pre-registered; eight new families, two seed pools); Note 21 clean-environment reproduction log; Table S17 reproducibility and version map; Table S18 two-level auditability (retrievable vs statement located) of the Note 8 sample; Note 17 component ablation, community survey and external cohorts (R6 §3.5–3.6 verbatim) and earlier-release eICU rows; Fig. S1 provenance audit; Fig. S2 per-release eICU metrics; Fig. S3 per-group panel-supported recall; Fig. S4 per-group calibration; Fig. S5 context-echo analysis; Fig. S6 participant flow; Data 1 per-stay outputs and LLM prompts/outputs.</w:t>
+        <w:t>Notes: Note 1 SAP and amendments; Table S1 engine change log C1–C16 with sources; Table S2 quarantine criteria and outcomes (rounds 1 and 2); Note 2 LLM comparison protocol; Table S3 participant flow and baseline characteristics; Note 3 fusion/Theory-of-Evidence algorithm and consistency identities; Table S4 subgroup recall; Table S5 next-test utility (engine v5.3, superseded metric); Tables S6–S6c calibration, recalibration, decision curves, multiplicity and panel-size sensitivity; Table S7 survey-weighted NHANES AUROC; Table S8 per-group calibration; Table S9 label-mapping audit (400 stays); Table S10 registry count reconciliation; Table S11 precision/F1/NDCG, alert burden, per-group PPV and prevalence baseline; Table S12 fusion-weight sensitivity; Table S12b historical comparisons (superseded); Table S13 participant flow for the UCI cohorts; Table S15 open vs proprietary components; Table S16 sepsis companion model; Note 4 regression gate; Note 5 definitions, audits and completed TRIPOD+AI checklist; Note 6 version manifest; Note 7 evidence triage of twelve proposals; Note 8 source-concordance audit; Notes 9–12 material moved from the main text; Note 13 black-box property-conformance benchmark (engine and LLM on identical perturbed panels); Note 14 executable verifier behind the LLM and verified-consensus arm; Note 15 activity-guided provenance audit; Note 16 audit study (core sufficiency, mutation testing, second LLM-written corpus); Note 18 per-rule verification ledger and its closure in registry 15.3.0; Note 19 pre-specified protocol for the independent clinical concordance audit (sample frozen, not yet executed); Note 20 held-out mutation test of the static detectors (pre-registered; eight new families, two seed pools); Note 21 clean-environment reproduction log; Note 22 detail condensed from the main text in R9 (verbatim); Table S17 reproducibility and version map; Table S18 two-level auditability (retrievable vs statement located) of the Note 8 sample; Note 17 component ablation, community survey and external cohorts (R6 §3.5–3.6 verbatim) and earlier-release eICU rows; Fig. S1 provenance audit; Fig. S2 per-release eICU metrics; Fig. S3 per-group panel-supported recall; Fig. S4 per-group calibration; Fig. S5 context-echo analysis; Fig. S6 participant flow; Data 1 per-stay outputs and LLM prompts/outputs.</w:t>
       </w:r>
     </w:p>
     <w:p>

</xml_diff>